<commit_message>
General T&C v9: correzioni dello studio del 9/10 riportate anche in NL — tutte le lingue allineate all'IT corretta
Co-Authored-By: Claude Opus 5.5 (1M context) <noreply@anthropic.com>
</commit_message>
<xml_diff>
--- a/T&C/General T&C/Vers 9 - Multilanguage - Q4 2026/9_Termini_e_Condizioni_Generali_Fleequid_F0009_2026_NL.docx
+++ b/T&C/General T&C/Vers 9 - Multilanguage - Q4 2026/9_Termini_e_Condizioni_Generali_Fleequid_F0009_2026_NL.docx
@@ -1314,7 +1314,7 @@
                 <w:smallCaps/>
                 <w:noProof/>
               </w:rPr>
-              <w:t>Uitgestelde verkoop: aanbetaling en tijdelijk bij de Verkoper in gebruik blijvend Voertuig.</w:t>
+              <w:t>Uitgestelde verkoop: Aanbetaling en tijdelijk bij de Verkoper in gebruik blijvend Voertuig.</w:t>
             </w:r>
             <w:r>
               <w:rPr>
@@ -1646,7 +1646,7 @@
                 <w:noProof/>
                 <w:webHidden/>
               </w:rPr>
-              <w:t>67</w:t>
+              <w:t>68</w:t>
             </w:r>
             <w:r>
               <w:rPr>
@@ -1836,7 +1836,7 @@
                 <w:noProof/>
                 <w:webHidden/>
               </w:rPr>
-              <w:t>89</w:t>
+              <w:t>90</w:t>
             </w:r>
             <w:r>
               <w:rPr>
@@ -1931,7 +1931,7 @@
                 <w:noProof/>
                 <w:webHidden/>
               </w:rPr>
-              <w:t>93</w:t>
+              <w:t>94</w:t>
             </w:r>
             <w:r>
               <w:rPr>
@@ -3497,7 +3497,7 @@
           <w:sz w:val="20"/>
           <w:szCs w:val="20"/>
         </w:rPr>
-        <w:t>, houder van het merk Fleequid®. De term kan ook verwijzen naar andere rechtspersonen die gelieerd zijn aan of door Adorea S.r.l. zijn aangewezen voor de vermarkting van Voertuigen, overeenkomstig art. 2.9. Fleequid beheert de Marketplace en stelt de Diensten ter beschikking; de hoedanigheid waarin zij bij de afzonderlijke transactie optreedt, hangt af van het toepasselijke Verkoopmodel en, bij de Commissieverkoop, van de gekozen wijze van uitvoering, overeenkomstig de artt. 2.3-2.8, 3, 17 en 18. De positie van Fleequid met betrekking tot Voertuigen die als VFU of anderszins als afval kunnen worden aangemerkt, is geregeld in de artt. 16.13 en 18.8.</w:t>
+        <w:t>, houder van het merk Fleequid®. De term kan ook verwijzen naar andere rechtspersonen die gelieerd zijn aan of door Adorea S.r.l. zijn aangewezen voor de koop en verkoop van Voertuigen, overeenkomstig art. 2.9. Fleequid beheert de Marketplace en stelt de Diensten ter beschikking; de hoedanigheid waarin zij bij de afzonderlijke transactie optreedt, hangt af van het toepasselijke Verkoopmodel en, bij de Commissieverkoop, van de gekozen wijze van uitvoering, overeenkomstig de artt. 2.3-2.8, 3, 17 en 18. De positie van Fleequid met betrekking tot Voertuigen die als VFU of anderszins als afval kunnen worden aangemerkt, is geregeld in de artt. 16.13 en 18.8.</w:t>
       </w:r>
     </w:p>
     <w:p>
@@ -5291,7 +5291,7 @@
           <w:sz w:val="20"/>
           <w:szCs w:val="20"/>
         </w:rPr>
-        <w:t>Elke verwijzing in deze AV naar “</w:t>
+        <w:t>Tenzij de afzonderlijke bepaling uitdrukkelijk voorziet in een termijn in kalenderdagen, moet elke verwijzing in deze AV naar “</w:t>
       </w:r>
       <w:r>
         <w:rPr>
@@ -5310,7 +5310,7 @@
           <w:sz w:val="20"/>
           <w:szCs w:val="20"/>
         </w:rPr>
-        <w:t>” moet worden verstaan als een verwijzing naar werkdagen, waarbij onder “</w:t>
+        <w:t>” worden verstaan als een verwijzing naar werkdagen, waarbij onder “</w:t>
       </w:r>
       <w:r>
         <w:rPr>
@@ -5621,7 +5621,7 @@
           <w:sz w:val="20"/>
           <w:szCs w:val="20"/>
         </w:rPr>
-        <w:t>In het kader van de Commissieverkoop kan Fleequid naar eigen en uitsluitend goeddunken beslissen de Wederverkoop niet te verrichten en de opgedragen koop en verkoop uit te voeren als louter Tussenpersoon, waarbij zij mogelijk maakt dat de overdracht van het Voertuig en de desbetreffende facturering rechtstreeks van de Verkoper aan de Koper plaatsvinden. In dat geval wordt de koopovereenkomst met betrekking tot het Voertuig rechtstreeks tussen de Verkoper en de Koper gesloten; Fleequid sluit deze niet, noch in eigen naam noch als partij, koopt het Voertuig niet, ook niet tijdelijk, verkrijgt niet de hoedanigheid van verkoper, ook niet van formele verkoper, en de prijs van het Voertuig wordt door de Koper rechtstreeks aan de Verkoper voldaan; Fleequid behoudt het recht op de door beide Partijen verschuldigde Commissies en op de Tarieven overeenkomstig het bepaalde in deze Algemene Voorwaarden. Het optreden als louter Tussenpersoon vormt een interne wijze van uitvoering van de Commissieverkoop in de zin van art. 2.3 en geen zelfstandig Verkoopmodel. De in dit lid bedoelde keuzebevoegdheid wordt uitgeoefend overeenkomstig het bepaalde in de artt. 3.2, 3.5 en 17.1 en wordt vooraf kenbaar gemaakt en aanvaard overeenkomstig art. 3.2, letter a).</w:t>
+        <w:t>In het kader van de Commissieverkoop kan Fleequid naar eigen en uitsluitend goeddunken beslissen de Wederverkoop niet te verrichten en de opgedragen koop en verkoop uit te voeren als louter Tussenpersoon, waarbij zij mogelijk maakt dat de overdracht van het Voertuig en de desbetreffende facturering rechtstreeks van de Verkoper aan de Koper plaatsvinden. In dat geval wordt de koopovereenkomst met betrekking tot het Voertuig rechtstreeks tussen de Verkoper en de Koper gesloten; Fleequid sluit deze niet, noch in eigen naam noch als partij, koopt het Voertuig niet, ook niet tijdelijk, verkrijgt niet de hoedanigheid van verkoper, ook niet van formele verkoper, en de prijs van het Voertuig wordt door de Koper rechtstreeks aan de Verkoper voldaan; Fleequid behoudt het recht op de door beide Partijen verschuldigde Commissies en op de Tarieven overeenkomstig het bepaalde in deze Algemene Voorwaarden. Het optreden als louter Tussenpersoon vormt een interne wijze van uitvoering van de Commissieverkoop in de zin van art. 2.3 en geen zelfstandig Verkoopmodel. De in dit lid bedoelde keuzebevoegdheid wordt uitgeoefend overeenkomstig het bepaalde in de artt. 3.2, 3.5 en 17.1, wordt vooraf kenbaar gemaakt overeenkomstig art. 3.2, letter a), en wordt aanvaard door de instemming met deze AV.</w:t>
       </w:r>
     </w:p>
     <w:p>
@@ -6188,7 +6188,7 @@
           <w:sz w:val="20"/>
           <w:szCs w:val="20"/>
         </w:rPr>
-        <w:t>Fleequid behoudt zich het recht voor om deze Algemene Voorwaarden en het Fleequid-tarief op elk moment en naar eigen goeddunken eenzijdig te wijzigen, ook om nieuwe producten of Diensten te introduceren, de werkingsmodaliteiten van de Marketplace aan te passen dan wel om te voldoen aan wettelijke of reglementaire bepalingen of aan besluiten van de bevoegde autoriteiten. De wijzigingen worden ten minste 30 (dertig) dagen voordat zij van kracht worden op duidelijke en begrijpelijke wijze aan de Gebruikers meegedeeld, tenzij de Gebruiker deze vóór het verstrijken van deze termijn uitdrukkelijk heeft aanvaard. Fleequid houdt een archief bij van eerdere versies van de Algemene Voorwaarden en van het Fleequid-tarief, dat toegankelijk is door contact op te nemen met de klantenservice. De wijzigingen kunnen op een of meer van de volgende manieren worden meegedeeld: a) e-mail naar het e-mailadres dat is gekoppeld aan het profiel van de Gebruiker, met daarin een samenvatting van de wijzigingen en een link naar de bijgewerkte teksten; b) melding die bij de eerstvolgende aanmelding van de Gebruiker op de Marketplace wordt weergegeven; c) plaatsing van een aankondiging op de homepage van de Fleequid-website, met een link naar de bijgewerkte teksten. De Gebruiker die de wijzigingen niet wenst te aanvaarden, kan zonder boete opzeggen binnen 30 (dertig) dagen na de mededeling en in elk geval na de publicatie van de bijgewerkte Algemene Voorwaarden op de Marketplace, door middel van een schriftelijke kennisgeving aan het e-mailadres withdrawal@fleequid.com. De wijzigingen zijn van toepassing op de Verkoopevenementen en de transacties die na de inwerkingtreding ervan zijn aangevangen; op de reeds lopende Verkoopevenementen en transacties, alsmede op die waarvoor de Bindende Overeenstemming reeds tot stand is gekomen, blijven tot de afronding ervan de Algemene Voorwaarden en het Fleequid-tarief van toepassing die golden op het moment van aanvang van het desbetreffende Verkoopevenement of de desbetreffende transactie, behoudens het bepaalde in art. 4.9. Na ontvangst van de kennisgeving van opzegging gaat Fleequid over tot verwijdering van het profiel van de Gebruiker overeenkomstig het bepaalde in art. 5.11. Gebruikers zijn verplicht om vóór het uitbrengen van een Bod de geldende versie van de Algemene Voorwaarden en van het Fleequid-tarief te controleren door de desbetreffende sectie van de Marketplace te raadplegen. Na het verstrijken van de kennisgevingstermijn houdt het voortgezette gebruik van de Marketplace of van de Diensten van Fleequid de aanvaarding in van de in werking getreden wijzigingen. In het geval van een geschil over de versie of de toepasselijkheid van deze Algemene Voorwaarden op de Overeenkomst, moeten Gebruikers bewijzen dat zij, ondanks alle redelijke inspanningen, niet in staat zijn geweest om de toepasselijke Algemene Voorwaarden in te zien, ondanks het raadplegen van de desbetreffende sectie van de Marketplace en het tijdig indienen van een schriftelijk verzoek aan Fleequid, alvorens enig bezwaar, verzoek of klacht in te dienen.</w:t>
+        <w:t>Fleequid behoudt zich het recht voor om deze Algemene Voorwaarden en het Fleequid-tarief op elk moment en naar eigen goeddunken eenzijdig te wijzigen, ook om nieuwe producten of Diensten te introduceren, de werkingsmodaliteiten van de Marketplace aan te passen dan wel om te voldoen aan wettelijke of reglementaire bepalingen of aan besluiten van de bevoegde autoriteiten. De wijzigingen worden ten minste 30 (dertig) kalenderdagen voordat zij van kracht worden op duidelijke en begrijpelijke wijze aan de Gebruikers meegedeeld, tenzij de Gebruiker deze vóór het verstrijken van deze termijn uitdrukkelijk heeft aanvaard. Fleequid houdt een archief bij van eerdere versies van de Algemene Voorwaarden en van het Fleequid-tarief, dat toegankelijk is door contact op te nemen met de klantenservice. De wijzigingen kunnen op een of meer van de volgende manieren worden meegedeeld: a) e-mail naar het e-mailadres dat is gekoppeld aan het profiel van de Gebruiker, met daarin een samenvatting van de wijzigingen en een link naar de bijgewerkte teksten; b) melding die bij de eerstvolgende aanmelding van de Gebruiker op de Marketplace wordt weergegeven; c) plaatsing van een aankondiging op de homepage van de Fleequid-website, met een link naar de bijgewerkte teksten. De Gebruiker die de wijzigingen niet wenst te aanvaarden, kan zonder boete opzeggen binnen 30 (dertig) kalenderdagen na de mededeling en in elk geval na de publicatie van de bijgewerkte Algemene Voorwaarden op de Marketplace, door middel van een schriftelijke kennisgeving aan het e-mailadres withdrawal@fleequid.com. De wijzigingen zijn van toepassing op de Verkoopevenementen en de transacties die na de inwerkingtreding ervan zijn aangevangen; op de reeds lopende Verkoopevenementen en transacties, alsmede op die waarvoor de Bindende Overeenstemming reeds tot stand is gekomen, blijven tot de afronding ervan de Algemene Voorwaarden en het Fleequid-tarief van toepassing die golden op het moment van aanvang van het desbetreffende Verkoopevenement of de desbetreffende transactie, behoudens het bepaalde in art. 4.9. Na ontvangst van de kennisgeving van opzegging gaat Fleequid over tot verwijdering van het profiel van de Gebruiker overeenkomstig het bepaalde in art. 5.11. Gebruikers zijn verplicht om vóór het uitbrengen van een Bod de geldende versie van de Algemene Voorwaarden en van het Fleequid-tarief te controleren door de desbetreffende sectie van de Marketplace te raadplegen. Na het verstrijken van de kennisgevingstermijn houdt het voortgezette gebruik van de Marketplace of van de Diensten van Fleequid de aanvaarding in van de in werking getreden wijzigingen. In het geval van een geschil over de versie of de toepasselijkheid van deze Algemene Voorwaarden op de Overeenkomst, moeten Gebruikers bewijzen dat zij, ondanks alle redelijke inspanningen, niet in staat zijn geweest om de toepasselijke Algemene Voorwaarden in te zien, ondanks het raadplegen van de desbetreffende sectie van de Marketplace en het tijdig indienen van een schriftelijk verzoek aan Fleequid, alvorens enig bezwaar, verzoek of klacht in te dienen.</w:t>
       </w:r>
     </w:p>
     <w:p>
@@ -6680,7 +6680,7 @@
           <w:sz w:val="20"/>
           <w:szCs w:val="20"/>
         </w:rPr>
-        <w:t>Fleequid zal de Gebruiker onverwijld schriftelijk op de hoogte stellen van de maatregelen die overeenkomstig het voorgaande art. 5.5 zijn genomen, met vermelding van de redenen daarvoor. Afhankelijk van de aard en de ernst van de vastgestelde omstandigheden kan Fleequid onmiddellijk de maatregelen nemen die nodig zijn om de gewraakte situatie te beëindigen of te beperken, dan wel de Gebruiker verzoeken deze binnen een termijn van 30 (dertig) dagen te verhelpen. Na het vruchteloos verstrijken van deze termijn kan Fleequid het profiel van de Gebruiker opschorten of blokkeren, ook voor onbepaalde tijd, of diens toegang tot de Marketplace en de bijbehorende Diensten beperken. Voornoemde termijn is niet van toepassing wanneer: a) Fleequid moet voldoen aan een wettelijke of reglementaire verplichting of aan een beslissing van de bevoegde autoriteit die de onmiddellijke beëindiging of beperking van de levering van Voertuigen of Diensten aan de Gebruiker vereist; b) is voldaan aan de voorwaarden voor de onmiddellijke ontbinding van de Overeenkomst krachtens de wet of deze Algemene Voorwaarden; c) de Gebruiker herhaaldelijk de gebruiksregels van de Marketplace heeft geschonden; d) de gegevens of de inhoud die aan de Gebruiker zijn toe te rekenen onrechtmatig of ongepast zijn, dan wel zijn gedrag de veiligheid of de goede werking van de Marketplace, van Fleequid of van de andere Gebruikers in gevaar kan brengen; e) het gedrag verband houdt met fraude, vervalsing, inbreuken op het gebied van persoonsgegevens, spam of andere onrechtmatige of oneigenlijke activiteiten. In die gevallen kan Fleequid de maatregel nemen zonder voorafgaande sommatie, waarbij zij de Gebruiker niettemin de motivering daarvan verstrekt. De Gebruikersclassificatie bedoeld in art. 6 vormt geen maatregel in de zin van dit lid en is niet onderworpen aan de hier bepaalde procedure. Evenzo vormt de beperking of opschorting van de functionaliteit van het account die overeenkomstig art. 12.10 wordt opgelegd aan de Koper die in vertraging is of in de nakoming tekortschiet, een zelfstandige maatregel die door die bepaling wordt beheerst, die niet opgaat in de in dit lid bepaalde procedure en die niet afhankelijk is van de daarvoor geldende voorwaarden en termijnen.</w:t>
+        <w:t>Fleequid zal de Gebruiker onverwijld schriftelijk op de hoogte stellen van de maatregelen die overeenkomstig het voorgaande art. 5.5 zijn genomen, met vermelding van de redenen daarvoor. Afhankelijk van de aard en de ernst van de vastgestelde omstandigheden kan Fleequid onmiddellijk de maatregelen nemen die nodig zijn om de gewraakte situatie te beëindigen of te beperken, dan wel de Gebruiker verzoeken deze binnen een termijn van 30 (dertig) dagen te verhelpen. Na het vruchteloos verstrijken van deze termijn kan Fleequid het profiel van de Gebruiker opschorten of blokkeren, ook voor onbepaalde tijd, of diens toegang tot de Marketplace en de bijbehorende Diensten beperken. Voornoemde termijn is niet van toepassing wanneer: a) Fleequid moet voldoen aan een wettelijke of reglementaire verplichting of aan een beslissing van de bevoegde autoriteit die de onmiddellijke beëindiging of beperking van de levering van Voertuigen of Diensten aan de Gebruiker vereist; b) is voldaan aan de voorwaarden voor de onmiddellijke ontbinding van de Overeenkomst krachtens de wet of deze Algemene Voorwaarden; c) de Gebruiker herhaaldelijk de gebruiksregels van de Marketplace heeft geschonden; d) de gegevens of de inhoud die aan de Gebruiker zijn toe te rekenen onrechtmatig of ongepast zijn, dan wel zijn gedrag de veiligheid of de goede werking van de Marketplace, van Fleequid of van de andere Gebruikers in gevaar kan brengen; e) het gedrag verband houdt met fraude, vervalsing, inbreuken op het gebied van persoonsgegevens, spam of andere onrechtmatige of oneigenlijke activiteiten. In die gevallen kan Fleequid de maatregel nemen zonder voorafgaande sommatie, waarbij zij de Gebruiker niettemin de motivering daarvan verstrekt. De Gebruikersclassificatie bedoeld in art. 6 vormt geen maatregel in de zin van dit lid en is niet onderworpen aan de hier bepaalde procedure. Evenzo vormt de beperking of opschorting van de functionaliteit van het profiel die overeenkomstig art. 12.10 wordt opgelegd aan de Koper die in vertraging is of in de nakoming tekortschiet, een zelfstandige maatregel die door die bepaling wordt beheerst, die niet opgaat in de in dit lid bepaalde procedure en die niet afhankelijk is van de daarvoor geldende voorwaarden en termijnen.</w:t>
       </w:r>
     </w:p>
     <w:p>
@@ -6780,7 +6780,7 @@
           <w:sz w:val="20"/>
           <w:szCs w:val="20"/>
         </w:rPr>
-        <w:t>. Dit systeem is opgezet overeenkomstig art. 11 van Verordening (EU) 2019/1150, die Fleequid ook op vrijwillige basis toepast waar deze niet rechtstreeks van toepassing is. Krachtens art. 12 van voornoemde Verordening wordt elk geschil met betrekking tot de toepassing van de bepalingen van dit artikel voorgelegd aan een bemiddelingspoging van de Kamer van Bemiddeling bij de Kamer van Koophandel van Como, waarmee Fleequid verklaart te willen samenwerken, met het oog op een bemiddelingspoging die wordt geleid door een aangewezen bemiddelaar die een natuurlijke persoon is en optreedt overeenkomstig het bemiddelingsreglement van die Kamer van Koophandel, dat de Gebruiker kan raadplegen in het daartoe bestemde gedeelte van de desbetreffende institutionele website. De regeling van de klachtenprocedure met betrekking tot de Voertuigen bedoeld in art. 20 blijft onverminderd van toepassing.</w:t>
+        <w:t>. Dit systeem is opgezet overeenkomstig art. 11 van Verordening (EU) 2019/1150, die Fleequid ook op vrijwillige basis toepast waar deze niet rechtstreeks van toepassing is. Krachtens art. 12 van voornoemde Verordening worden de geschillen met betrekking tot de toegang tot de Marketplace, het gebruik ervan en de maatregelen tot beperking, opschorting of beëindiging van de toegang of van de activiteiten van de Gebruiker die Fleequid overeenkomstig dit artikel heeft genomen, voorgelegd aan een bemiddelingspoging van de Kamer van Bemiddeling bij de Kamer van Koophandel van Como, waarmee Fleequid verklaart te willen samenwerken, met het oog op een bemiddelingspoging die wordt geleid door een aangewezen bemiddelaar die een natuurlijke persoon is en optreedt overeenkomstig het bemiddelingsreglement van die Kamer van Koophandel, dat de Gebruiker kan raadplegen in het daartoe bestemde gedeelte van de desbetreffende institutionele website. De regeling van de klachtenprocedure met betrekking tot de Voertuigen bedoeld in art. 20 blijft onverminderd en zelfstandig van toepassing; op die procedure is de in dit lid bedoelde bemiddelingspoging niet van toepassing, tenzij het geschil tevens, op zelfstandige wijze, een van de in de vorige volzin genoemde aangelegenheden betreft.</w:t>
       </w:r>
     </w:p>
     <w:p>
@@ -6952,7 +6952,7 @@
           <w:sz w:val="20"/>
           <w:szCs w:val="20"/>
         </w:rPr>
-        <w:t>Het bedrag van de Waarborgsom wordt door Fleequid vastgesteld op basis van het Verkoopevenement, de kenmerken en de economische waarde van het Voertuig, het aan de specifieke transactie verbonden risico en, indien van toepassing, de Gebruikersclassificatie. Deze Algemene Voorwaarden leggen geen star en uniform standaardbedrag vast. Onverminderd de gewoonlijk toegepaste voorwaarden en de eventuele door Fleequid toegekende gunstige voorwaarden of vrijstellingen, kan de Gebruikersclassificatie leiden tot de toepassing van gedifferentieerde waarborgregelingen, ingedeeld naar het type Voertuig en het type Verkoopevenement en in de regel als volgt opgebouwd: (i) waarborgregeling van het eerste niveau: 2.000,00 € voor Voertuigen die voor sloop bestemd zijn; 1.000,00 € voor de 1 Euro Auctions; 1.000,00 € voor Voertuigen met een Reserveprijs tot 50.000,00 €; 2.000,00 € voor Voertuigen met een Reserveprijs van meer dan 50.000,00 €; (ii) waarborgregeling van het tweede niveau: 2.000,00 € voor elk Verkoopevenement. De toepassing van een van voornoemde regelingen, dan wel van een ander bedrag dat overeenkomstig de eerste volzin is vastgesteld, vereist niet dat aan de Gebruiker een specifieke kwalificatie of benaming wordt toegekend of meegedeeld, onverminderd het bepaalde in art. 6.1 inzake de voorafgaande kenbaarheid van de verplichting tot voldoening en van het bedrag daarvan, hetgeen in ieder geval voorrang heeft op de gewoonlijk toegepaste waarden.</w:t>
+        <w:t>Het bedrag van de Waarborgsom wordt door Fleequid vastgesteld op basis van het Verkoopevenement, de kenmerken en de economische waarde van het Voertuig, het aan de specifieke transactie verbonden risico en, indien van toepassing, de Gebruikersclassificatie. Deze Algemene Voorwaarden leggen geen star en uniform standaardbedrag vast. Onverminderd de gewoonlijk toegepaste voorwaarden en de eventuele door Fleequid toegekende gunstige voorwaarden of vrijstellingen, kan de Gebruikersclassificatie leiden tot de toepassing van gedifferentieerde waarborgregelingen, ingedeeld naar het type Voertuig en het type Verkoopevenement en in de regel als volgt opgebouwd: (i) waarborgregeling van het eerste niveau: 2.000,00 € voor Voertuigen die voor sloop bestemd zijn; 1.000,00 € voor de 1 Euro Auctions; 1.000,00 € voor Voertuigen met een Reserveprijs tot 50.000,00 €; 2.000,00 € voor Voertuigen met een Reserveprijs van meer dan 50.000,00 €; (ii) waarborgregeling van het tweede niveau: 2.000,00 € voor elk Verkoopevenement. De toepassing van een van voornoemde regelingen, dan wel van een ander bedrag dat overeenkomstig de eerste volzin is vastgesteld, vereist niet dat aan de Gebruiker een specifieke kwalificatie of benaming wordt toegekend of meegedeeld, onverminderd het bepaalde in art. 6.1 inzake de voorafgaande kenbaarheid van de verplichting tot voldoening en van het bedrag daarvan; de verplichting en het bedrag die overeenkomstig art. 6.1 concreet aan de Bieder kenbaar zijn gemaakt, hebben in ieder geval voorrang op de gewoonlijk toegepaste waarden.</w:t>
       </w:r>
     </w:p>
     <w:p>
@@ -7129,7 +7129,7 @@
           <w:sz w:val="20"/>
           <w:szCs w:val="20"/>
         </w:rPr>
-        <w:t xml:space="preserve">Bij registratie op de Marketplace van Fleequid verklaart de geregistreerde Gebruiker kennis te hebben genomen van het Privacybeleid, opgesteld in overeenstemming met de toepasselijke wetgeving en met art. 13 van de AVG -Verordening (EU) 2016/679 dat kan worden geraadpleegd via de volgende link: </w:t>
+        <w:t xml:space="preserve">Bij registratie op de Marketplace van Fleequid verklaart de geregistreerde Gebruiker kennis te hebben genomen van het Privacybeleid, dat kan worden geraadpleegd via de volgende link: </w:t>
       </w:r>
       <w:hyperlink r:id="rId16" w:history="1">
         <w:r>
@@ -7142,7 +7142,7 @@
           <w:sz w:val="20"/>
           <w:szCs w:val="20"/>
         </w:rPr>
-        <w:t>. De verwerking van persoonsgegevens vindt plaats met inachtneming van alle voorzorgsmaatregelen die de veiligheid en vertrouwelijkheid ervan waarborgen, in overeenstemming met de bepalingen van de AVG voor de doeleinden en met de doelstellingen vermeld in het Privacybeleid. Dit beleid beschrijft en verduidelijkt tevens de rechten en procedures waarover de betrokkene beschikt met betrekking tot zijn/haar persoonsgegevens.</w:t>
+        <w:t>, opgesteld in overeenstemming met de toepasselijke wetgeving en met art. 13 van de AVG - Verordening (EU) 2016/679. De verwerking van persoonsgegevens vindt plaats met inachtneming van alle voorzorgsmaatregelen die de veiligheid en vertrouwelijkheid ervan waarborgen, in overeenstemming met de bepalingen van de AVG voor de doeleinden en met de doelstellingen vermeld in het Privacybeleid. Dit beleid beschrijft en verduidelijkt tevens de rechten en procedures waarover de betrokkene beschikt met betrekking tot zijn/haar persoonsgegevens.</w:t>
       </w:r>
     </w:p>
     <w:p>
@@ -7516,7 +7516,7 @@
           <w:sz w:val="20"/>
           <w:szCs w:val="20"/>
         </w:rPr>
-        <w:t>Zodra de overeenkomstig art. 8.8 aangegane verbintenis tot vermarkting is geëindigd, kan de Verkoper, indien het Voertuig niet is verkocht, zelfstandig via enig ander kanaal tot de verkoop ervan overgaan, zonder enige beperking inzake minimumprijs en aan elke partij, onverminderd de verplichtingen tot overdracht van het Voertuig die eventueel reeds zijn ontstaan of nog openstaan met betrekking tot een specifieke transactie, in het bijzonder in het kader van Dealer Sales. De Verkoper blijft verplicht geen gebruik te maken van informatie, contacten of commerciële kansen die via de Marketplace of via Fleequid zijn verkregen, met het doel direct of indirect transacties te sluiten die erop gericht zijn de tussenkomst van Fleequid te omzeilen. Deze verplichting blijft gelden gedurende 24 (vierentwintig) maanden vanaf de eerste publicatie van de Advertentie met betrekking tot het Voertuig op de Marketplace dan wel, indien niet in de publicatie van een Advertentie is voorzien, vanaf de eerste door Fleequid verrichte handeling tot vermarkting van het Voertuig. In geval van schending heeft Fleequid het recht de Verkoper de boete op te leggen die wordt vastgesteld volgens het in art. 8.9 bepaalde criterium. Indien de Verkoper, wanneer hij volgens het toepasselijke Verkoopmodel en deze Algemene Voorwaarden tot overdracht van het Voertuig gehouden is, zonder gegronde reden weigert de eigendom ervan over te dragen: a) aan Fleequid, in het kader van de Commissieverkoop die door middel van Wederverkoop wordt uitgevoerd, is de Verkoper gehouden een boete te betalen gelijk aan 30% van de Verkoopprijs voor de Koper; b) aan Fleequid, in het kader van Dealer Sales, is de Verkoper gehouden een boete te betalen gelijk aan 30% van de Aankoopprijs die Fleequid aan de Verkoper verschuldigd is; c) rechtstreeks aan de Koper, in de gevallen waarin Fleequid overeenkomstig art. 2.6 optreedt als louter Tussenpersoon, is de Verkoper gehouden aan Fleequid een boete te betalen gelijk aan 30% van de Verkoopprijs voor de Koper. Voor de toepassing van dit lid wordt de weigering geacht vast te staan wanneer zij blijkt uit een verklaring van de Verkoper of uit een gedraging van hem die ondubbelzinnig onverenigbaar is met de nakoming dan wel, bij gebreke daarvan, wanneer de Verkoper de specifieke verplichting niet nakomt binnen 10 (tien) dagen na de schriftelijke sommatie waarbij Fleequid hem heeft verzocht deze na te komen. Het recht van Fleequid op vergoeding van de eventuele verdere schade blijft onverlet, evenals, in de gevallen waarin de Koopovereenkomst rechtstreeks tussen de Verkoper en de Koper tot stand komt, alle aan laatstgenoemde toekomende rechten en rechtsmiddelen. Bij Dealer Sales omvat de aan Fleequid te vergoeden verdere schade ook de bedragen die zij als gevolg van de tekortkoming van de Verkoper aan haar eigen Koper dient te betalen, alsmede de desbetreffende vergoedingen, boetes, kosten en uitgaven. Eveneens onverlet blijven de overige in deze Algemene Voorwaarden bepaalde rechtsmiddelen, met inbegrip van die bedoeld in de artt. 16.9 en 17.8 en, wanneer Fleequid optreedt als louter Tussenpersoon, in art. 17.14, onverminderd de afstemming van de desbetreffende boetes overeenkomstig art. 15.8. In het bijzonder geldt dat, indien de verkoop van het Voertuig aan derden of een andere gelijkwaardige gedraging tijdens de Optiestatus tegelijkertijd de schending van de in art. 8.9 bedoelde exclusiviteit, de in dit lid geregelde weigering de eigendom over te dragen dan wel het in art. 16.9 bedoelde niet ter beschikking stellen of niet leveren oplevert, de desbetreffende boetes niet worden gecumuleerd wanneer zij uit hetzelfde concrete feit voortvloeien en hetzelfde belang beschermen: er is uitsluitend één enkele boete van toepassing, die met toepassing van het in art. 15.8 bedoelde criterium wordt bepaald in de volgende volgorde: (i) de in dit lid bepaalde boete, indien de gedraging volgens de hierboven vermelde criteria de weigering de eigendom over te dragen oplevert; (ii) bij gebreke van weigering, de in art. 16.9 bepaalde boetes, indien de gedraging leidt tot het niet ter beschikking stellen of niet leveren van het Voertuig, gevolgd door de Annulering van de verkoop; (iii) in de overige gevallen, de in art. 8.9 bepaalde boete wegens schending van de exclusiviteit; de gevolgen die niet het karakter van een boete hebben en de gevolgen die voortvloeien uit concreet onderscheiden feiten blijven onverlet.</w:t>
+        <w:t>Zodra de overeenkomstig art. 8.8 aangegane verbintenis tot vermarkting is geëindigd, kan de Verkoper, indien het Voertuig niet is verkocht, zelfstandig via enig ander kanaal tot de verkoop ervan overgaan, zonder enige beperking inzake minimumprijs en aan elke partij, onverminderd de verplichtingen tot overdracht van het Voertuig die eventueel reeds zijn ontstaan of nog openstaan met betrekking tot een specifieke transactie, in het bijzonder in het kader van Dealer Sales. De Verkoper blijft verplicht geen gebruik te maken van informatie, contacten of commerciële kansen die via de Marketplace of via Fleequid zijn verkregen, met het doel direct of indirect transacties te sluiten die erop gericht zijn de tussenkomst van Fleequid te omzeilen. Deze verplichting blijft gelden gedurende 24 (vierentwintig) maanden vanaf de eerste publicatie van de Advertentie met betrekking tot het Voertuig op de Marketplace dan wel, indien niet in de publicatie van een Advertentie is voorzien, vanaf de eerste door Fleequid verrichte handeling tot vermarkting van het Voertuig. In geval van schending heeft Fleequid het recht de Verkoper de boete op te leggen die wordt vastgesteld volgens het in art. 8.9 bepaalde criterium. Indien de Verkoper, wanneer hij volgens het toepasselijke Verkoopmodel en deze Algemene Voorwaarden tot overdracht van het Voertuig gehouden is, zonder gegronde reden weigert de eigendom ervan over te dragen: a) aan Fleequid, in het kader van de Commissieverkoop die door middel van Wederverkoop wordt uitgevoerd, is de Verkoper gehouden aan haar een boete te betalen gelijk aan 30% van de Verkoopprijs voor de Koper; b) aan Fleequid, in het kader van Dealer Sales, is de Verkoper gehouden aan haar een boete te betalen gelijk aan 30% van de Aankoopprijs die Fleequid aan de Verkoper verschuldigd is; c) rechtstreeks aan de Koper, in de gevallen waarin Fleequid overeenkomstig art. 2.6 optreedt als louter Tussenpersoon, is de Verkoper gehouden aan Fleequid een boete te betalen gelijk aan 30% van de Verkoopprijs voor de Koper. Voor de toepassing van dit lid wordt de weigering geacht vast te staan wanneer zij blijkt uit een verklaring van de Verkoper of uit een gedraging van hem die ondubbelzinnig onverenigbaar is met de nakoming dan wel, bij gebreke daarvan, wanneer de Verkoper de specifieke verplichting niet nakomt binnen 10 (tien) dagen na de schriftelijke sommatie waarbij Fleequid hem heeft verzocht deze na te komen. Het recht van Fleequid op vergoeding van de eventuele verdere schade blijft onverlet, evenals, in de gevallen waarin de Koopovereenkomst rechtstreeks tussen de Verkoper en de Koper tot stand komt, alle aan laatstgenoemde toekomende rechten en rechtsmiddelen. Bij Dealer Sales omvat de aan Fleequid te vergoeden verdere schade ook de bedragen die zij als gevolg van de tekortkoming van de Verkoper aan haar eigen Koper dient te betalen, alsmede de desbetreffende vergoedingen, boetes, kosten en uitgaven. Eveneens onverlet blijven de overige in deze Algemene Voorwaarden bepaalde rechtsmiddelen, met inbegrip van die bedoeld in de artt. 16.9 en 17.8 en, wanneer Fleequid optreedt als louter Tussenpersoon, in art. 17.14, onverminderd de afstemming van de desbetreffende boetes overeenkomstig art. 15.8. In het bijzonder geldt dat, indien de verkoop van het Voertuig aan derden of een andere gelijkwaardige gedraging tijdens de Optiestatus tegelijkertijd de schending van de in art. 8.9 bedoelde exclusiviteit, de in dit lid geregelde weigering de eigendom over te dragen dan wel het in art. 16.9 bedoelde niet ter beschikking stellen of niet leveren oplevert, de desbetreffende boetes niet worden gecumuleerd wanneer zij uit hetzelfde concrete feit voortvloeien en hetzelfde belang beschermen: er is uitsluitend één enkele boete van toepassing, die met toepassing van het in art. 15.8 bedoelde criterium wordt bepaald in de volgende volgorde: (i) de in dit lid bepaalde boete, indien de gedraging volgens de hierboven vermelde criteria de weigering de eigendom over te dragen oplevert; (ii) bij gebreke van weigering, de in art. 16.9 bepaalde boetes, indien de gedraging leidt tot het niet ter beschikking stellen of niet leveren van het Voertuig, gevolgd door de Annulering van de verkoop; (iii) in de overige gevallen, de in art. 8.9 bepaalde boete wegens schending van de exclusiviteit; de gevolgen die niet het karakter van een boete hebben en de gevolgen die voortvloeien uit concreet onderscheiden feiten blijven onverlet.</w:t>
       </w:r>
     </w:p>
     <w:p>
@@ -7566,7 +7566,7 @@
           <w:sz w:val="20"/>
           <w:szCs w:val="20"/>
         </w:rPr>
-        <w:t>De Verkoper verbindt zich ertoe Fleequid, de door haar gecontroleerde, met haar verbonden of aan haar gelieerde vennootschappen, alsmede hun bestuurders, vennoten, werknemers, medewerkers, agenten en vertegenwoordigers te vrijwaren en schadeloos te stellen voor alle aanspraken, vorderingen, rechtszaken, rechtsvorderingen, geschillen, schade, kosten, uitgaven of lasten van welke aard ook die voortvloeien uit: a) onwaarheden, omissies, onjuistheden of schendingen met betrekking tot de verklaringen, de garanties en de verbintenissen die de Verkoper krachtens deze Algemene Voorwaarden op zich heeft genomen, met inbegrip van, bij wijze van voorbeeld en zonder beperking, omissies of onjuistheden in de Technische Specificaties of in de informatie over de staat, de kenmerken en de werking van het Voertuig, zoals de aanwezigheid van niet-gemelde roest, het slecht functioneren van de airconditioning, het ontbreken van onderdelen of toebehoren, de aanwezigheid van brandende storings- of waarschuwingslampjes en soortgelijke gevallen; b) de aanwezigheid van gevaarlijke stoffen die met het Voertuig verband houden of verontreinigingen als gevolg van lekkages, uitstromingen, storingen of defecten in de werking; c) het niet, onvolledig of te laat overleggen van de documentatie, ook in origineel, die nodig is voor de overdracht, de tenaamstelling, de levering of de deelname aan het verkeer van het Voertuig; d) Bezwaringen op het Voertuig die niet uitdrukkelijk door de Verkoper zijn gemeld en in het kader van de specifieke transactie zijn aanvaard; e) bedragen die door Fleequid zijn betaald of kosten die door Fleequid zijn gemaakt in verband met onkosten, voorrechten, rechten, beperkingen of aanspraken, al dan niet geregistreerd, die door schuldeisers, autoriteiten of andere partijen op het Voertuig of in verband daarmee geldend worden gemaakt, teneinde het vrije juridische verkeer of de overdracht ervan mogelijk te maken; f) de niet-naleving van de toepasselijke wetgeving, ook op milieugebied, met inbegrip van elke aansprakelijkheid in verband met de kwalificatie, het houden, het beheer, het vervoer, de nuttige toepassing of de verwijdering van Voertuigen die voor sloop bestemd zijn of als VFU kunnen worden aangemerkt, alsmede in verband met het niet, onvolledig of te laat meedelen aan Fleequid van de desbetreffende bestemming of kwalificatie; g) oneigenlijk of niet-conform gebruik van de Marketplace door de Verkoper; h) belastingen, heffingen, kosten, uitgaven of andere lasten die voortvloeien uit de niet-naleving door de Verkoper van wetten, voorschriften of verplichtingen die met betrekking tot het Voertuig of de transactie op hem van toepassing zijn; i) elke andere verwijtbare, opzettelijke of anderszins onrechtmatige gedraging van de Verkoper in verband met deze Algemene Voorwaarden, de Overeenkomsten of de specifieke transactie. De onder letter a) vermelde voorbeelden hebben een louter illustratief karakter en beperken op geen enkele wijze de algemene reikwijdte van de vrijwaring. Deze vrijwaring strekt zich bij Dealer Sales uitdrukkelijk uit tot de aanspraken die de Koper jegens Fleequid in haar hoedanigheid van daadwerkelijke verkoper geldend maakt en tot alle bedragen, vergoedingen, kosten, reparatiekosten, lasten en schade die Fleequid jegens haar eigen Koper dient te betalen of te dragen wegens feiten, gebreken, defecten, omissies of tekortkomingen die aan de Verkoper zijn toe te rekenen; in die gevallen heeft Fleequid een regresrecht jegens de Verkoper en recht op volledige vergoeding van hetgeen zij heeft betaald of gedragen. De Verkoper blijft verantwoordelijk voor de juistheid, de volledigheid en de waarheidsgetrouwheid van het Verkoopvoorstel, de Technische Specificaties, het eventuele technisch dossier, de Advertentie en de documentatie met betrekking tot het Voertuig, ook wanneer deze inhoud met de ondersteuning van Fleequid is opgesteld of aangevuld en ook indien het Voertuig het voorwerp is geweest van een TrustReport of van inspecties die door Fleequid of door haar aangestelden zijn uitgevoerd. De Verkoper is gehouden de beschikbaar gestelde informatie te controleren en elke onjuistheid onverwijld aan Fleequid te melden, alsmede vóór de overdracht van het Voertuig elk gebrek, elk defect, elk ongeval, elke wijziging, elke storing of elke afwijking waarvan hij kennis heeft, mee te delen. Behoudens in geval van opzet of grove schuld van Fleequid is zij niet aansprakelijk voor de gevolgen die voortvloeien uit onjuistheden, onvolledigheden of afwijkingen in de informatie met betrekking tot het Voertuig die aan de Verkoper zijn toe te rekenen, noch voor vertragingen bij de actualisering van het Verkoopvoorstel, de Advertentie, het technisch dossier of de andere aan de Gebruikers ter beschikking gestelde informatie wanneer deze vertragingen te wijten zijn aan omstandigheden die niet aan Fleequid zijn toe te rekenen. Fleequid garandeert bovendien niet de opbrengsten die met de vermarkting of de verkoop van het Voertuig kunnen worden behaald.</w:t>
+        <w:t>De Verkoper verbindt zich ertoe Fleequid, de door haar gecontroleerde, met haar verbonden of aan haar gelieerde vennootschappen, alsmede hun bestuurders, vennoten, werknemers, medewerkers, agenten en vertegenwoordigers te vrijwaren en schadeloos te stellen voor alle aanspraken, vorderingen, rechtszaken, rechtsvorderingen, geschillen, schade, kosten, uitgaven of lasten van welke aard ook die voortvloeien uit: a) onwaarheden, omissies, onjuistheden of schendingen met betrekking tot de verklaringen, de garanties en de verbintenissen die de Verkoper krachtens deze Algemene Voorwaarden op zich heeft genomen, met inbegrip van, bij wijze van voorbeeld en zonder beperking, omissies of onjuistheden in de Technische Specificaties of in de informatie over de staat, de kenmerken en de werking van het Voertuig, zoals de aanwezigheid van niet-gemelde roest, het slecht functioneren van de airconditioning, het ontbreken van onderdelen of toebehoren, de aanwezigheid van brandende storings- of waarschuwingslampjes en soortgelijke gevallen; b) de aanwezigheid van gevaarlijke stoffen die met het Voertuig verband houden of verontreinigingen als gevolg van lekkages, uitstromingen, storingen of defecten in de werking; c) het niet, onvolledig of te laat overleggen van de documentatie, ook in origineel, die nodig is voor de overdracht, de tenaamstelling, de levering of de deelname aan het verkeer van het Voertuig; d) andere Bezwaringen op het Voertuig dan die welke uitdrukkelijk door de Verkoper zijn gemeld en in het kader van de specifieke transactie zijn aanvaard; e) bedragen die door Fleequid zijn betaald of kosten die door Fleequid zijn gemaakt in verband met onkosten, voorrechten, rechten, beperkingen of aanspraken, al dan niet geregistreerd, die door schuldeisers, autoriteiten of andere partijen op het Voertuig of in verband daarmee geldend worden gemaakt, teneinde het vrije juridische verkeer of de overdracht ervan mogelijk te maken; f) de niet-naleving van de toepasselijke wetgeving, ook op milieugebied, met inbegrip van elke aansprakelijkheid in verband met de kwalificatie, het houden, het beheer, het vervoer, de nuttige toepassing of de verwijdering van Voertuigen die voor sloop bestemd zijn of als VFU kunnen worden aangemerkt, alsmede in verband met het niet, onvolledig of te laat meedelen aan Fleequid van de desbetreffende bestemming of kwalificatie; g) oneigenlijk of niet-conform gebruik van de Marketplace door de Verkoper; h) belastingen, heffingen, kosten, uitgaven of andere lasten die voortvloeien uit de niet-naleving door de Verkoper van wetten, voorschriften of verplichtingen die met betrekking tot het Voertuig of de transactie op hem van toepassing zijn; i) elke andere verwijtbare, opzettelijke of anderszins onrechtmatige gedraging van de Verkoper in verband met deze Algemene Voorwaarden, de Overeenkomsten of de specifieke transactie. De onder letter a) vermelde voorbeelden hebben een louter illustratief karakter en beperken op geen enkele wijze de algemene reikwijdte van de vrijwaring. Deze vrijwaring strekt zich bij Dealer Sales uitdrukkelijk uit tot de aanspraken die de Koper jegens Fleequid in haar hoedanigheid van daadwerkelijke verkoper geldend maakt en tot alle bedragen, vergoedingen, kosten, reparatiekosten, lasten en schade die Fleequid jegens haar eigen Koper dient te betalen of te dragen wegens feiten, gebreken, defecten, omissies of tekortkomingen die aan de Verkoper zijn toe te rekenen; in die gevallen heeft Fleequid een regresrecht jegens de Verkoper en recht op volledige vergoeding van hetgeen zij heeft betaald of gedragen. De Verkoper blijft verantwoordelijk voor de juistheid, de volledigheid en de waarheidsgetrouwheid van het Verkoopvoorstel, de Technische Specificaties, het eventuele technisch dossier, de Advertentie en de documentatie met betrekking tot het Voertuig, ook wanneer deze inhoud met de ondersteuning van Fleequid is opgesteld of aangevuld en ook indien het Voertuig het voorwerp is geweest van een TrustReport of van inspecties die door Fleequid of door haar aangestelden zijn uitgevoerd. De Verkoper is gehouden de beschikbaar gestelde informatie te controleren en elke onjuistheid onverwijld aan Fleequid te melden, alsmede vóór de overdracht van het Voertuig elk gebrek, elk defect, elk ongeval, elke wijziging, elke storing of elke afwijking waarvan hij kennis heeft, mee te delen. Behoudens in geval van opzet of grove schuld van Fleequid is zij niet aansprakelijk voor de gevolgen die voortvloeien uit onjuistheden, onvolledigheden of afwijkingen in de informatie met betrekking tot het Voertuig die aan de Verkoper zijn toe te rekenen, noch voor vertragingen bij de actualisering van het Verkoopvoorstel, de Advertentie, het technisch dossier of de andere aan de Gebruikers ter beschikking gestelde informatie wanneer deze vertragingen te wijten zijn aan omstandigheden die niet aan Fleequid zijn toe te rekenen. Fleequid garandeert bovendien niet de opbrengsten die met de vermarkting of de verkoop van het Voertuig kunnen worden behaald.</w:t>
       </w:r>
     </w:p>
     <w:p>
@@ -8713,7 +8713,7 @@
           <w:sz w:val="20"/>
           <w:szCs w:val="20"/>
         </w:rPr>
-        <w:t>Behoudens het bepaalde in de volgende leden bedraagt de Betalingstermijn 3 (drie) werkdagen, te rekenen vanaf de terbeschikkingstelling van de Proforma aan de Koper overeenkomstig art. 11.4. De Betalingstermijn loopt uitsluitend vanaf dat moment en op voorwaarde dat de Proforma de gegevens bevat die noodzakelijk zijn om de Koper in staat te stellen de betaling te verrichten. Indien Fleequid optreedt als louter Tussenpersoon, geldt dezelfde Termijn zowel voor de betaling van de aan de Verkoper verschuldigde prijs als voor de betaling van de Commissies, de Tarieven en de eventuele verdere bedragen die aan Fleequid verschuldigd zijn.</w:t>
+        <w:t>Behoudens het bepaalde in de volgende leden bedraagt de Betalingstermijn 3 (drie) dagen, te rekenen vanaf de terbeschikkingstelling van de Proforma aan de Koper overeenkomstig art. 11.4. De Betalingstermijn loopt uitsluitend vanaf dat moment en op voorwaarde dat de Proforma de gegevens bevat die noodzakelijk zijn om de Koper in staat te stellen de betaling te verrichten. Indien Fleequid optreedt als louter Tussenpersoon, geldt dezelfde Termijn zowel voor de betaling van de aan de Verkoper verschuldigde prijs als voor de betaling van de Commissies, de Tarieven en de eventuele verdere bedragen die aan Fleequid verschuldigd zijn.</w:t>
       </w:r>
     </w:p>
     <w:p>
@@ -8984,7 +8984,7 @@
           <w:sz w:val="20"/>
           <w:szCs w:val="20"/>
         </w:rPr>
-        <w:t>Indien de Koper de betaling verricht door middel van meerdere overmakingen die niet vooraf door Fleequid zijn goedgekeurd, maar het Totaal Verschuldigd Bedrag binnen de Betalingstermijn volledig voldoet, is hij aan Fleequid bij wijze van boete een bedrag van 150,00 € (honderdvijftig/00 euro) verschuldigd voor elk betrokken Voertuig, onverminderd de vergoeding van de verdere schade. De in dit lid bedoelde schending is zelfstandig en onderscheiden van de vertraging in de betaling; de desbetreffende boete wordt niet meegerekend bij de vaststelling van de boetecomponent die relevant is voor de in art. 12.9, laatste volzin, bedoelde minimumdrempel.</w:t>
+        <w:t>Indien de Koper de betaling verricht door middel van meerdere overmakingen die niet vooraf door Fleequid zijn goedgekeurd, maar het Totaal Verschuldigd Bedrag binnen de Betalingstermijn volledig voldoet, is hij aan Fleequid bij wijze van boete een bedrag van 150,00 € (honderdvijftig/00 euro) verschuldigd voor elk betrokken Voertuig, onverminderd de vergoeding van de verdere schade. De in dit lid bedoelde schending is zelfstandig en onderscheiden van de vertraging in de betaling; de desbetreffende boete wordt niet meegerekend bij de vaststelling van de boetecomponent die relevant is voor de in art. 12.9 bedoelde minimumdrempel.</w:t>
       </w:r>
     </w:p>
     <w:p>
@@ -9084,7 +9084,7 @@
           <w:sz w:val="20"/>
           <w:szCs w:val="20"/>
         </w:rPr>
-        <w:t>In geval van Annulering van de verkoop wegens vertraging of niet volledige betaling die aan de Koper is toe te rekenen, blijven definitief aan Fleequid verschuldigd: a) de Commissies ten laste van de Koper, voor zover voor de specifieke transactie bepaald, overeenkomstig art. 12.4; b) de in art. 12.6, letter a), bedoelde dagboete die tot de datum waarop de Annulering van de verkoop van kracht wordt is verbeurd, alsmede de verschuldigd geworden vertragingsrente; c) bij de Commissieverkoop, zowel wanneer Fleequid door middel van Wederverkoop handelt als wanneer zij optreedt als louter Tussenpersoon, een aanvullende boete ter hoogte van tweemaal de Commissies ten laste van de Koper, vastgesteld op basis van de Commissies die op de specifieke transactie van toepassing zijn, zodat het voor Commissies en voor deze boete in totaal verschuldigde bedrag gelijk is aan driemaal het bedrag van de Commissies; d) een aanvullende boete van 1.000,00 € (duizend/00 euro) voor elk Voertuig waarop de naderhand geannuleerde Bindende Overeenstemming betrekking heeft; e) de Tarieven voor de reeds verleende Diensten en elk ander bedrag dat uit onderscheiden hoofde verschuldigd is geworden op grond van deze Algemene Voorwaarden. Bij Dealer Sales is, aangezien de Koper geen Commissies volgens de Commissieverkoop verschuldigd is, de in letter c) bedoelde boete niet van toepassing; de in de letters b), d) en e) bedoelde bedragen blijven daarentegen verschuldigd. Indien aan de voorwaarden van art. 13 is voldaan, blijft tevens de omzetting van de Aanbetaling in een boete overeenkomstig art. 13.6 gelden. De in dit lid bedoelde bedragen zijn uit onderscheiden hoofde verschuldigd en kunnen worden gecumuleerd binnen de door de wet toegestane grenzen. De eventueel gestelde Waarborgsom strekt uitsluitend tot zekerheid voor de verbintenissen van de Koper en kan worden aangewend ter voldoening van de verschuldigde bedragen overeenkomstig art. 6.3, zonder een verdere grond voor het in rekening brengen van bedragen te vormen. Het recht van Fleequid op vergoeding van de verdere schade blijft onverlet, uitsluitend voor het meerdere boven hetgeen reeds door middel van de in deze Algemene Voorwaarden bepaalde boetes is voldaan. Indien de som van de boetes bedoeld in de letters b), beperkt tot de dagboete, c) en d) alsmede, indien van toepassing, van de boete die voortvloeit uit de omzetting van de Aanbetaling overeenkomstig art. 13.6, lager is dan 5% van de Verkoopprijs voor de Koper van het Voertuig waarop de geannuleerde verkoop betrekking heeft, wordt de in totaal verschuldigde boetecomponent uitsluitend aangevuld tot die drempel, die als economische ondergrens werkt en niet als verdere cumulatieve sanctie. Voor de vergelijking en de aanvulling bedoeld in de vorige volzin: (i) bestaat de berekeningsgrondslag uitsluitend uit de Verkoopprijs voor de Koper van het Voertuig waarop de geannuleerde verkoop betrekking heeft, met uitsluiting van het Totaal Verschuldigd Bedrag, de Commissies, de Tarieven en elk ander bijkomend bedrag; (ii) worden uitsluitend de hierboven vermelde boetes in aanmerking genomen die eigen zijn aan de tekortkoming van de Koper; (iii) worden de Commissies ten laste van de Koper, de Tarieven, de vertragingsrente, de ingehouden of aangewende Waarborgsom, de vergoedingen van kosten en uitgaven en de vergoeding van de verdere schade niet in aanmerking genomen. Deze bepaling is van toepassing op alle Verkoopmodellen; bij Dealer Sales wordt de vergelijking uitsluitend gemaakt met de aldaar toepasselijke boetes, zonder dat de in letter c) bedoelde boete kan worden ingevoerd of meegerekend.</w:t>
+        <w:t>In geval van Annulering van de verkoop wegens vertraging of niet volledige betaling die aan de Koper is toe te rekenen, blijven definitief aan Fleequid verschuldigd: a) de Commissies ten laste van de Koper, voor zover voor de specifieke transactie bepaald, overeenkomstig art. 12.4; b) de in art. 12.6, letter a), bedoelde dagboete die tot de datum waarop de Annulering van de verkoop van kracht wordt is verbeurd, alsmede de verschuldigd geworden vertragingsrente; c) bij de Commissieverkoop, zowel wanneer Fleequid door middel van Wederverkoop handelt als wanneer zij optreedt als louter Tussenpersoon, een aanvullende boete ter hoogte van tweemaal de Commissies ten laste van de Koper, vastgesteld op basis van de Commissies die op de specifieke transactie van toepassing zijn, zodat het voor Commissies en voor deze boete in totaal verschuldigde bedrag gelijk is aan driemaal het bedrag van de Commissies; d) een aanvullende boete van 1.000,00 € (duizend/00 euro) voor elk Voertuig waarop de naderhand geannuleerde Bindende Overeenstemming betrekking heeft; e) de Tarieven voor de reeds verleende Diensten en elk ander bedrag dat uit onderscheiden hoofde verschuldigd is geworden op grond van deze Algemene Voorwaarden. Bij Dealer Sales is, aangezien de Koper de voor de Commissieverkoop bepaalde Commissies niet verschuldigd is, de in letter c) bedoelde boete niet van toepassing; de in de letters b), d) en e) bedoelde bedragen blijven daarentegen verschuldigd. Indien aan de voorwaarden van art. 13 is voldaan, blijft tevens de omzetting van de Aanbetaling in een boete overeenkomstig art. 13.6 gelden. De in dit lid bedoelde bedragen zijn uit onderscheiden hoofde verschuldigd en kunnen worden gecumuleerd binnen de door de wet toegestane grenzen. De eventueel gestelde Waarborgsom strekt uitsluitend tot zekerheid voor de verbintenissen van de Koper en kan worden aangewend ter voldoening van de verschuldigde bedragen overeenkomstig art. 6.3, zonder een verdere grond voor het in rekening brengen van bedragen te vormen. Het recht van Fleequid op vergoeding van de verdere schade blijft onverlet, uitsluitend voor het meerdere boven hetgeen reeds door middel van de in deze Algemene Voorwaarden bepaalde boetes is voldaan. Indien de som van de boetes bedoeld in de letters b), beperkt tot de dagboete, c) en d) alsmede, indien van toepassing, van de boete die voortvloeit uit de omzetting van de Aanbetaling overeenkomstig art. 13.6, lager is dan 5% van de Verkoopprijs voor de Koper van het Voertuig waarop de geannuleerde verkoop betrekking heeft, wordt de in totaal verschuldigde boetecomponent uitsluitend aangevuld tot die drempel, die als economische ondergrens werkt en niet als verdere cumulatieve sanctie. Voor de vergelijking en de aanvulling bedoeld in de vorige volzin: (i) bestaat de berekeningsgrondslag uitsluitend uit de Verkoopprijs voor de Koper van het Voertuig waarop de geannuleerde verkoop betrekking heeft, met uitsluiting van het Totaal Verschuldigd Bedrag, de Commissies, de Tarieven en elk ander bijkomend bedrag; (ii) worden uitsluitend de hierboven vermelde boetes in aanmerking genomen die eigen zijn aan de tekortkoming van de Koper; (iii) worden de Commissies ten laste van de Koper, de Tarieven, de vertragingsrente, de ingehouden of aangewende Waarborgsom, de vergoedingen van kosten en uitgaven en de vergoeding van de verdere schade niet in aanmerking genomen. Deze bepaling is van toepassing op alle Verkoopmodellen; bij Dealer Sales wordt de vergelijking uitsluitend gemaakt met de aldaar toepasselijke boetes, zonder dat de in letter c) bedoelde boete kan worden ingevoerd of meegerekend.</w:t>
       </w:r>
     </w:p>
     <w:p>
@@ -9228,7 +9228,7 @@
           <w:sz w:val="20"/>
           <w:szCs w:val="20"/>
         </w:rPr>
-        <w:t>Uitgestelde verkoop: aanbetaling en tijdelijk bij de Verkoper in gebruik blijvend Voertuig.</w:t>
+        <w:t>Uitgestelde verkoop: Aanbetaling en tijdelijk bij de Verkoper in gebruik blijvend Voertuig.</w:t>
       </w:r>
       <w:bookmarkEnd w:id="83"/>
       <w:bookmarkEnd w:id="84"/>
@@ -9303,7 +9303,7 @@
           <w:sz w:val="20"/>
           <w:szCs w:val="20"/>
         </w:rPr>
-        <w:t>Bij transacties waarbij uitdrukkelijk is overeengekomen dat het Voertuig na de totstandkoming van de Bindende Overeenstemming tijdelijk bij de Verkoper in gebruik blijft, kan Fleequid van de Koper de vooraf te verrichten betaling van een bedrag ter hoogte van 30% van het Totaal Verschuldigd Bedrag verlangen (de “Aanbetaling”). Het in dit artikel geregelde geval wordt, uitsluitend voor beschrijvende en commerciële doeleinden, aangeduid als “Uitgestelde verkoop”. De Uitgestelde verkoop vormt geen zelfstandig Verkoopmodel en blijft volledig onderworpen aan het Verkoopmodel dat op de specifieke transactie van toepassing is en, in het kader van de Commissieverkoop, aan de desbetreffende wijze van uitvoering. De Uitgestelde verkoop kan uitsluitend worden overeengekomen bij de Commissieverkoop die door middel van Wederverkoop wordt uitgevoerd en bij Dealer Sales en vindt geen toepassing wanneer Fleequid optreedt als louter Tussenpersoon; bij transacties in het kader van de Commissieverkoop waarop dit artikel van toepassing is, voert Fleequid de transactie derhalve uit door middel van Wederverkoop. De omstandigheid dat het Voertuig tijdelijk bij de Verkoper in gebruik blijft, moet, samen met de op de transactie toepasselijke bijzondere voorwaarden, vóór het uitbrengen van het Bod aan de Bieder kenbaar worden gemaakt overeenkomstig de artt. 3.2 en 4.5. Indien de Aanbetaling wordt verlangd, moet zij worden voldaan binnen de gewone Betalingstermijn bedoeld in art. 11.5, die ingaat op het moment waarop de Proforma ter beschikking wordt gesteld, tenzij de Bijzondere Verkoopvoorwaarden uitdrukkelijk een andere termijn bepalen overeenkomstig art. 11.6, letter b). Deze regeling is uitsluitend op dat geval van toepassing en vormt een afwijking van de gewone regeling van de Betalingstermijn binnen de grenzen van dit artikel en van de toepasselijke Bijzondere Verkoopvoorwaarden.</w:t>
+        <w:t>Bij transacties waarbij uitdrukkelijk is overeengekomen dat het Voertuig na de totstandkoming van de Bindende Overeenstemming tijdelijk bij de Verkoper in gebruik blijft, kan Fleequid van de Koper de vooraf te verrichten betaling van een bedrag ter hoogte van 30% van het Totaal Verschuldigd Bedrag verlangen (de “Aanbetaling”). Het in dit artikel geregelde geval wordt, uitsluitend voor beschrijvende en commerciële doeleinden, aangeduid als “Uitgestelde verkoop”. De Uitgestelde verkoop vormt geen zelfstandig Verkoopmodel en blijft volledig onderworpen aan het Verkoopmodel dat op de specifieke transactie van toepassing is en, in het kader van de Commissieverkoop, aan de desbetreffende wijze van uitvoering. De Uitgestelde verkoop kan uitsluitend worden overeengekomen bij de Commissieverkoop die door middel van Wederverkoop wordt uitgevoerd en bij Dealer Sales en vindt geen toepassing wanneer Fleequid optreedt als louter Tussenpersoon; bij transacties in het kader van de Commissieverkoop waarop dit artikel van toepassing is, voert Fleequid de transactie derhalve uit door middel van Wederverkoop. De omstandigheid dat het Voertuig tijdelijk bij de Verkoper in gebruik blijft, moet, samen met de op de transactie toepasselijke Bijzondere Verkoopvoorwaarden, vóór het uitbrengen van het Bod aan de Bieder kenbaar worden gemaakt overeenkomstig de artt. 3.2 en 4.5. Indien de Aanbetaling wordt verlangd, moet zij worden voldaan binnen de gewone Betalingstermijn bedoeld in art. 11.5, die ingaat op het moment waarop de Proforma ter beschikking wordt gesteld, tenzij de Bijzondere Verkoopvoorwaarden uitdrukkelijk een andere termijn bepalen overeenkomstig art. 11.6, letter b). Deze regeling is uitsluitend op dat geval van toepassing en vormt een afwijking van de gewone regeling van de Betalingstermijn binnen de grenzen van dit artikel en van de toepasselijke Bijzondere Verkoopvoorwaarden.</w:t>
       </w:r>
     </w:p>
     <w:p>
@@ -9403,7 +9403,7 @@
           <w:sz w:val="20"/>
           <w:szCs w:val="20"/>
         </w:rPr>
-        <w:t>Het niet betalen van de Aanbetaling binnen de desbetreffende termijn dan wel het niet volledig betalen van het saldo uiterlijk op de voor de specifieke transactie bepaalde vervaldatum levert vertraging van de Koper op. Vanaf de eerste dag na de respectieve vervaldatum zijn, voor zover verenigbaar, de bepalingen van art. 12.6 van toepassing, met inbegrip van de boete van 150,00 € voor elke dag vertraging en voor elk betrokken Voertuig, tot het in art. 12.6, letter a), bepaalde totale maximumbedrag, dat voor elk Voertuig en voor dezelfde transactie als één geheel geldt voor zowel de vertraging bij de betaling van de Aanbetaling als de vertraging bij de betaling van het saldo, alsmede de aldaar bepaalde rente en verdere bedragen. Bij niet-betaling van de Aanbetaling zijn de termijnen en bevoegdheden bedoeld in art. 12.7 van toepassing. Bij niet-betaling van het saldo behoudt Fleequid, in plaats van de in art. 12.7 bepaalde maximumtermijn, de bevoegdheid om de te late betaling te ontvangen gedurende de 4 (vier) dagen na de voor de betaling van het saldo vastgestelde vervaldatum, zonder dat vanaf die vervaldatum een nieuwe termijn van 7 (zeven) dagen gaat lopen. Na het vruchteloos verstrijken van die termijn zonder volledige betaling kan Fleequid naar eigen goeddunken de te late betaling alsnog aanvaarden dan wel overgaan tot Annulering van de verkoop overeenkomstig art. 12.7, met de gevolgen bedoeld in de artt. 12.8 en 12.9.</w:t>
+        <w:t>Het niet betalen van de Aanbetaling binnen de desbetreffende termijn dan wel het niet volledig betalen van het saldo uiterlijk op de voor de specifieke transactie bepaalde vervaldatum levert vertraging van de Koper op. Vanaf de eerste dag na de respectieve vervaldatum zijn, voor zover verenigbaar, de bepalingen van art. 12.6 van toepassing, met inbegrip van de boete van 150,00 € (honderdvijftig/00 euro) voor elke dag vertraging en voor elk betrokken Voertuig, tot het in art. 12.6, letter a), bepaalde totale maximumbedrag, dat voor elk Voertuig en voor dezelfde transactie als één geheel geldt voor zowel de vertraging bij de betaling van de Aanbetaling als de vertraging bij de betaling van het saldo, alsmede de aldaar bepaalde rente en verdere bedragen. Bij niet-betaling van de Aanbetaling zijn de termijnen en bevoegdheden bedoeld in art. 12.7 van toepassing. Bij niet-betaling van het saldo behoudt Fleequid, in plaats van de in art. 12.7 bepaalde maximumtermijn, de bevoegdheid om de te late betaling te ontvangen gedurende de 4 (vier) dagen na de voor de betaling van het saldo vastgestelde vervaldatum, zonder dat vanaf die vervaldatum een nieuwe termijn van 7 (zeven) dagen gaat lopen. Na het vruchteloos verstrijken van die termijn zonder volledige betaling kan Fleequid naar eigen goeddunken de te late betaling alsnog aanvaarden dan wel overgaan tot Annulering van de verkoop overeenkomstig art. 12.7, met de gevolgen bedoeld in de artt. 12.8 en 12.9.</w:t>
       </w:r>
     </w:p>
     <w:p>
@@ -9574,7 +9574,7 @@
           <w:sz w:val="20"/>
           <w:szCs w:val="20"/>
         </w:rPr>
-        <w:t>De Annulering van de verkoop is de contractuele rechtsfiguur waarmee Fleequid, in de gevallen waarin deze Algemene Voorwaarden, de Specifieke Voorwaarden of de toepasselijke Bijzondere Verkoopvoorwaarden voorzien, bepaalt dat de transactie niet wordt uitgevoerd of niet langer wordt uitgevoerd, geheel of beperkt tot een of meer Voertuigen. De Annulering van de verkoop valt niet noodzakelijkerwijs samen met de vernietiging van de overeenkomst wegens ongeldigheidsgronden en evenmin met de ontbinding wegens tekortkoming: de concrete rechtsgrond hangt af van het afzonderlijke geval dat daartoe aanleiding geeft. Wanneer de Annulering het gevolg is van een tekortkoming waarvoor krachtens deze Algemene Voorwaarden een uitdrukkelijk ontbindingsbeding geldt, werkt zij als ontbinding van de Overeenkomst overeenkomstig art. 1456 van het Italiaans Burgerlijk Wetboek en heeft zij de gevolgen daarvan. In de overige gevallen heeft de Annulering de gevolgen bepaald in de bepaling die erin voorziet en, voor zover niet anders geregeld, de gevolgen bepaald in dit artikel en in art. 15.</w:t>
+        <w:t>De Annulering van de verkoop is de contractuele rechtsfiguur waarmee Fleequid, in de gevallen waarin deze Algemene Voorwaarden, de toepasselijke Specifieke Voorwaarden of de toepasselijke Bijzondere Verkoopvoorwaarden voorzien, bepaalt dat de transactie niet wordt uitgevoerd of niet langer wordt uitgevoerd, geheel of beperkt tot een of meer Voertuigen. De Annulering van de verkoop valt niet noodzakelijkerwijs samen met de vernietiging van de overeenkomst wegens ongeldigheidsgronden en evenmin met de ontbinding wegens tekortkoming: de concrete rechtsgrond hangt af van het afzonderlijke geval dat daartoe aanleiding geeft. Wanneer de Annulering het gevolg is van een tekortkoming waarvoor krachtens deze Algemene Voorwaarden een uitdrukkelijk ontbindingsbeding geldt, werkt zij als ontbinding van de Overeenkomst overeenkomstig art. 1456 van het Italiaans Burgerlijk Wetboek en heeft zij de gevolgen daarvan. In de overige gevallen heeft de Annulering de gevolgen bepaald in de bepaling die erin voorziet en, voor zover niet anders geregeld, de gevolgen bepaald in dit artikel en in art. 15.</w:t>
       </w:r>
     </w:p>
     <w:p>
@@ -9970,7 +9970,7 @@
           <w:sz w:val="20"/>
           <w:szCs w:val="20"/>
         </w:rPr>
-        <w:t>Indien de Annulering van de verkoop, de ontbinding van de Overeenkomst of een ander geval waarin deze Algemene Voorwaarden voorzien, geheel of gedeeltelijk het herstel van de vroegere toestand meebrengt nadat de eigendomsoverdracht van het Voertuig, de levering ervan of de betaling van bedragen reeds heeft plaatsgevonden, zijn de Partijen gehouden onverwijld alle voor het herstel noodzakelijke handelingen te verrichten en medewerking te verlenen, met inbegrip van de terugbetaling van de ontvangen bedragen, de teruggave of teruglevering van het Voertuig, de ondertekening en de afgifte van de vereiste documenten, de vervulling van de administratieve formaliteiten en de terugoverdracht van de eigendom of de wijziging van de tenaamstelling. Indien de titel op grond waarvan de Verkoper bedragen met betrekking tot het Voertuig heeft ontvangen, geheel of gedeeltelijk vervalt, is de Verkoper gehouden het ontvangene volledig terug te betalen, binnen de grenzen die overeenstemmen met de restitutiegevolgen van het specifieke geval. In het bijzonder: a) bij de Commissieverkoop die door middel van Wederverkoop wordt uitgevoerd, betaalt de Verkoper aan Fleequid de bedragen terug die deze hem eventueel reeds heeft betaald met betrekking tot het Voertuig dat wordt teruggegeven; b) indien Fleequid als louter Tussenpersoon is opgetreden, betaalt de Verkoper de prijs en de verdere door hem ontvangen bedragen rechtstreeks aan de Koper terug en is hij, indien Fleequid de door de Verkoper verschuldigde bedragen geheel of gedeeltelijk aan de Koper heeft voorgeschoten, gehouden deze aan Fleequid te vergoeden; c) bij Dealer Sales, indien de Annulering of de ontbinding tevens meebrengt dat de gevolgen van de tussen de Verkoper en Fleequid tot stand gekomen aankoop geheel of gedeeltelijk vervallen, betaalt de Verkoper aan Fleequid de reeds ontvangen Aankoopprijs en de verdere bedragen die moeten worden terugbetaald, terug. De in dit lid bedoelde terugbetalingen van bedragen moeten plaatsvinden binnen de in art. 15.2 bepaalde termijn, en elke daartoe gehouden partij is tevens verplicht binnen de in art. 15.5 bepaalde termijnen de creditnota's, de storno- of correctiedocumenten en de verdere eventueel vereiste fiscale documenten uit te reiken en toe te zenden; vertraging bij de uitreiking of de toezending van die documenten schort de verplichting tot terugbetaling van de bedragen niet op en stelt deze niet uit, behoudens hetgeen de wet dwingend bepaalt. Wanneer het specifieke geval de teruggave van het Voertuig aan de Verkoper meebrengt, is laatstgenoemde gehouden de eigendom ervan, indien reeds overgedragen, opnieuw te verwerven of anderszins terug te verkrijgen, het Voertuig weer in bezit te nemen en tijdig alle voor de desbetreffende formaliteiten noodzakelijke medewerking te verlenen; deze regeling is in het bijzonder van toepassing bij de Commissieverkoop, zowel wanneer Fleequid door middel van Wederverkoop heeft gehandeld als wanneer zij als louter Tussenpersoon is opgetreden, voor zover verenigbaar met de structuur van de specifieke transactie. Bij Dealer Sales wordt het Voertuig, indien de Annulering uitsluitend de verkoop tussen Fleequid en de Koper betreft, aan Fleequid teruggegeven; indien de Annulering of de ontbinding tevens meebrengt dat de gevolgen van de rechtsverhouding inzake aankoop tussen de Verkoper en Fleequid geheel of gedeeltelijk vervallen, is de Verkoper gehouden de eigendom en het bezit van het Voertuig terug te verkrijgen en alle daartoe noodzakelijke handelingen te verrichten. De Verkoper of de Koper die gehouden is tot terugbetaling van bedragen, tot teruggave of teruglevering van het Voertuig, tot terugoverdracht van de eigendom of wijziging van de tenaamstelling, tot afhaling van het Voertuig, tot teruggave van de desbetreffende documenten of tot vervulling van de noodzakelijke formaliteiten, mag zijn nakoming niet zonder gegronde reden weigeren of vertragen. Onverminderd de in art. 15.2 bepaalde vervaldatum voor de terugbetaling van de bedragen, moeten de handelingen betreffende de teruggave of teruglevering van het Voertuig, de terugoverdracht of de wijziging van de tenaamstelling, de afhaling en de desbetreffende documentatie worden verricht binnen 5 (vijf) dagen na het schriftelijke verzoek van Fleequid, tenzij de aard van de handeling of dwingende wettelijke bepalingen een andere termijn vereisen. Na het vruchteloos verstrijken van de toepasselijke termijn door een toe te rekenen omstandigheid is de tekortschietende Verkoper of Koper gehouden aan Fleequid bij wijze van boete een bedrag te betalen van 150,00 € (honderdvijftig/00 euro) voor elke dag vertraging en voor elk betrokken Voertuig, tot een totaal maximumbedrag van 5.000,00 € (vijfduizend/00 euro) per Voertuig, onverminderd de vergoeding van de verdere schade. Indien met betrekking tot hetzelfde Voertuig tegelijkertijd meerdere in dit lid bepaalde restitutieverplichtingen ten laste van dezelfde partij niet zijn nagekomen, wordt voornoemde dagboete slechts eenmaal toegepast voor elke dag vertraging en voor elk Voertuig, onverminderd de verdere boetes waarin deze Algemene Voorwaarden voorzien voor afzonderlijke feiten of tekortkomingen. Onverminderd voornoemde boete kan Fleequid, bij gebreke van tijdige nakoming, rechtstreeks of via derden en binnen de door de wet toegestane grenzen, de maatregelen nemen die redelijkerwijs noodzakelijk zijn voor de bewaring, de opslag, het transport, de instandhouding, het terughalen of het beheer van het Voertuig, waarbij de desbetreffende kosten en uitgaven volledig aan de tekortschietende partij in rekening worden gebracht. Vanaf het verstrijken van de voor de nakoming bepaalde termijn draagt de tekortschietende partij bovendien, binnen de door de wet toegestane grenzen, de risico's en lasten die uit haar vertraging voortvloeien, en kan zij zich niet beroepen op het uitblijven van de terugbetaling van de bedragen, op het niet afhalen of niet terugleveren van het Voertuig, op het niet ondertekenen van de documenten of op haar eigen gebrek aan medewerking om de restitutiegevolgen op te schorten of te vertragen. De definitieve verdeling van de kosten betreffende de overdracht of terugoverdracht van de eigendom, de wijziging van de tenaamstelling, het transport, de teruglevering, de bewaring en de opslag van het Voertuig wordt geregeld door de bepaling die van toepassing is op de grond van de Annulering of de ontbinding. Bij gebreke van een specifieke bepaling komen die kosten voor rekening van de partij aan wie de grond van de Annulering of de ontbinding is toe te rekenen, voor zover zij daarvan het gevolg zijn; indien de desbetreffende grond aan geen van de Partijen is toe te rekenen, vindt de verdeling plaats overeenkomstig de op het specifieke geval toepasselijke regeling en de wettelijke bepalingen.</w:t>
+        <w:t>Indien de Annulering van de verkoop, de ontbinding van de Overeenkomst of een ander geval waarin deze Algemene Voorwaarden voorzien, geheel of gedeeltelijk het herstel van de vroegere toestand meebrengt nadat de eigendomsoverdracht van het Voertuig, de levering ervan of de betaling van bedragen reeds heeft plaatsgevonden, zijn de Partijen gehouden onverwijld alle voor het herstel noodzakelijke handelingen te verrichten en medewerking te verlenen, met inbegrip van de terugbetaling van de ontvangen bedragen, de teruggave of teruglevering van het Voertuig, de ondertekening en de afgifte van de vereiste documenten, de vervulling van de administratieve formaliteiten en de terugoverdracht van de eigendom of de wijziging van de tenaamstelling. Indien de titel op grond waarvan de Verkoper bedragen met betrekking tot het Voertuig heeft ontvangen, geheel of gedeeltelijk vervalt, is de Verkoper gehouden het ontvangene volledig terug te betalen, binnen de grenzen die overeenstemmen met de restitutiegevolgen van het specifieke geval. In het bijzonder: a) bij de Commissieverkoop die door middel van Wederverkoop wordt uitgevoerd, betaalt de Verkoper aan Fleequid de bedragen terug die deze hem eventueel reeds heeft betaald met betrekking tot het Voertuig dat wordt teruggegeven; b) indien Fleequid als louter Tussenpersoon is opgetreden, betaalt de Verkoper de prijs en de verdere door hem ontvangen bedragen rechtstreeks aan de Koper terug en is hij, indien Fleequid de door de Verkoper verschuldigde bedragen geheel of gedeeltelijk aan de Koper heeft voorgeschoten, gehouden deze aan Fleequid te vergoeden; c) bij Dealer Sales, indien de Annulering of de ontbinding tevens meebrengt dat de gevolgen van de tussen de Verkoper en Fleequid tot stand gekomen aankoop geheel of gedeeltelijk vervallen, betaalt de Verkoper aan Fleequid de reeds ontvangen Aankoopprijs en de verdere bedragen die moeten worden terugbetaald, terug. De in dit lid bedoelde terugbetalingen van bedragen moeten plaatsvinden binnen de in art. 15.2 bepaalde termijn, en elke daartoe gehouden partij is tevens verplicht binnen de in art. 15.5 bepaalde termijnen de creditnota's, de storno- of correctiedocumenten en de verdere eventueel vereiste fiscale documenten uit te reiken en toe te zenden; vertraging bij de uitreiking of de toezending van die documenten schort de verplichting tot terugbetaling van de bedragen niet op en stelt deze niet uit, behoudens hetgeen de wet dwingend bepaalt. Wanneer het specifieke geval de teruggave van het Voertuig aan de Verkoper meebrengt, is laatstgenoemde gehouden de eigendom ervan, indien reeds overgedragen, opnieuw te verwerven of anderszins terug te verkrijgen, het Voertuig weer in bezit te nemen en tijdig alle voor de desbetreffende formaliteiten noodzakelijke medewerking te verlenen; deze regeling is in het bijzonder van toepassing bij de Commissieverkoop, zowel wanneer Fleequid door middel van Wederverkoop heeft gehandeld als wanneer zij als louter Tussenpersoon is opgetreden, voor zover verenigbaar met de structuur van de specifieke transactie. Bij Dealer Sales wordt het Voertuig, indien de Annulering uitsluitend de verkoop tussen Fleequid en de Koper betreft, aan Fleequid teruggegeven; indien de Annulering of de ontbinding tevens meebrengt dat de gevolgen van de rechtsverhouding inzake aankoop tussen de Verkoper en Fleequid geheel of gedeeltelijk vervallen, is de Verkoper gehouden de eigendom en het bezit van het Voertuig terug te verkrijgen en alle daartoe noodzakelijke handelingen te verrichten. De Verkoper of de Koper die gehouden is tot terugbetaling van bedragen, tot teruggave of teruglevering van het Voertuig, tot terugoverdracht van de eigendom of wijziging van de tenaamstelling, tot afhaling van het Voertuig, tot teruggave van de desbetreffende documenten of tot vervulling van de noodzakelijke formaliteiten, mag zijn nakoming niet zonder gegronde reden weigeren of vertragen. Onverminderd de in art. 15.2 bepaalde vervaldatum voor de terugbetaling van de bedragen, moeten de handelingen betreffende de teruggave of teruglevering van het Voertuig, de terugoverdracht of de wijziging van de tenaamstelling, de afhaling en de desbetreffende documentatie worden verricht binnen 5 (vijf) dagen na het schriftelijke verzoek van Fleequid, tenzij de aard van de handeling of dwingende wettelijke bepalingen een andere termijn vereisen. Na het vruchteloos verstrijken van de toepasselijke termijn door een aan hem toe te rekenen omstandigheid is de tekortschietende Verkoper of Koper gehouden aan Fleequid bij wijze van boete een bedrag te betalen van 150,00 € (honderdvijftig/00 euro) voor elke dag vertraging en voor elk betrokken Voertuig, tot een totaal maximumbedrag van 5.000,00 € (vijfduizend/00 euro) per Voertuig, onverminderd de vergoeding van de verdere schade. Indien met betrekking tot hetzelfde Voertuig tegelijkertijd meerdere in dit lid bepaalde restitutieverplichtingen ten laste van dezelfde partij niet zijn nagekomen, wordt voornoemde dagboete slechts eenmaal toegepast voor elke dag vertraging en voor elk Voertuig, onverminderd de verdere boetes waarin deze Algemene Voorwaarden voorzien voor afzonderlijke feiten of tekortkomingen. Onverminderd voornoemde boete kan Fleequid, bij gebreke van tijdige nakoming, rechtstreeks of via derden en binnen de door de wet toegestane grenzen, de maatregelen nemen die redelijkerwijs noodzakelijk zijn voor de bewaring, de opslag, het transport, de instandhouding, het terughalen of het beheer van het Voertuig, waarbij de desbetreffende kosten en uitgaven volledig aan de tekortschietende partij in rekening worden gebracht. Vanaf het verstrijken van de voor de nakoming bepaalde termijn draagt de tekortschietende partij bovendien, binnen de door de wet toegestane grenzen, de risico's en lasten die uit haar vertraging voortvloeien, en kan zij zich niet beroepen op het uitblijven van de terugbetaling van de bedragen, op het niet afhalen of niet terugleveren van het Voertuig, op het niet ondertekenen van de documenten of op haar eigen gebrek aan medewerking om de restitutiegevolgen op te schorten of te vertragen. De definitieve verdeling van de kosten betreffende de overdracht of terugoverdracht van de eigendom, de wijziging van de tenaamstelling, het transport, de teruglevering, de bewaring en de opslag van het Voertuig wordt geregeld door de bepaling die van toepassing is op de grond van de Annulering of de ontbinding. Bij gebreke van een specifieke bepaling komen die kosten voor rekening van de partij aan wie de grond van de Annulering of de ontbinding is toe te rekenen, voor zover zij daarvan het gevolg zijn; indien de desbetreffende grond aan geen van de Partijen is toe te rekenen, vindt de verdeling plaats overeenkomstig de op het specifieke geval toepasselijke regeling en de wettelijke bepalingen.</w:t>
       </w:r>
     </w:p>
     <w:p>
@@ -10142,7 +10142,7 @@
           <w:sz w:val="20"/>
           <w:szCs w:val="20"/>
         </w:rPr>
-        <w:t>De eigendom van het Voertuig gaat uitsluitend op de Koper over na de volledige nakoming van de betalingsverplichting overeenkomstig art. 12.2; bij Veilingen valt dit tijdstip samen met de Definitieve Toewijzing. De Partijen komen uitdrukkelijk overeen dat de eigendomsovergang op de Koper tot dat tijdstip is uitgesteld, ongeacht het toepasselijke Verkoopmodel en de gekozen wijze van uitvoering, met inbegrip van de gevallen waarin Fleequid de eigendom van het Voertuig overeenkomstig art. 18 op een eerder tijdstip heeft verkregen en de gevallen waarin de verkoop rechtstreeks tussen de Verkoper en de Koper plaatsvindt wanneer Fleequid optreedt als louter Tussenpersoon. De formaliteiten van registratie, overschrijving, inschrijving of tenaamstelling en de andere handelingen die krachtens de toepasselijke wetgeving eventueel noodzakelijk zijn, blijven onverlet. Na ontvangst van alle documenten, informatie en medewerking van de Verkoper die overeenkomstig art. 16.3 noodzakelijk zijn, draagt degene die volgens het toepasselijke Verkoopmodel en de gekozen wijze van uitvoering tot de desbetreffende handeling gehouden is, binnen de daaropvolgende 10 (tien) dagen zorg voor de vervulling van de formaliteiten die noodzakelijk zijn voor de registratie, overschrijving, inschrijving of tenaamstelling van de overdracht van het Voertuig op naam van de Koper, tenzij de toepasselijke wetgeving, de aard van de transactie of de Specifieke Voorwaarden een andere volgorde of termijn vereisen; wanneer Fleequid optreedt als louter Tussenpersoon geldt deze termijn voor de Verkoper, behoudens de andere termijn waarin de Bijzondere Verkoopvoorwaarden eventueel voorzien gelet op de transactie, het land, de documentatie of de aard van het Voertuig. Wanneer Fleequid optreedt als louter Tussenpersoon, verlopen de handelingen van de Verkoper derhalve in twee opeenvolgende fasen: a) binnen de in art. 16.3 bepaalde termijn van 5 (vijf) dagen verstrekt de Verkoper de documenten, de verklaringen, de volmachten en de medewerking die noodzakelijk zijn voor de aanvang van de formaliteiten, waarbij in geval van vertraging de in datzelfde art. 16.3 bepaalde boete van toepassing is; b) binnen de daaropvolgende 10 (tien) dagen, te rekenen vanaf het tijdstip waarop aan de voorwaarden daarvoor is voldaan, voltooit de Verkoper de overdrachtsformaliteiten; in geval van een aan de Verkoper toe te rekenen vertraging na het verstrijken van die termijn is dezelfde boete van 150,00 € (honderdvijftig/00 euro) voor elke dag vertraging en voor elk betrokken Voertuig van toepassing, overeenkomstig de in art. 16.3 bepaalde afstemming met de artt. 8.11 en 16.9. De boete met betrekking tot de tweede fase wordt niet verbeurd over de dagen waarover reeds de boete met betrekking tot de eerste fase is verbeurd. De Koper neemt er kennis van dat de overdracht van het Voertuig en de deelname ervan aan het verkeer de voltooiing kunnen vereisen van formaliteiten van registratie, overschrijving, inschrijving of soortgelijke handelingen waarin de toepasselijke wetgeving van het betrokken land voorziet, en dat het Voertuig in de regel pas kan worden afgehaald na de voltooiing van de noodzakelijke formaliteiten. Bij wijze van uitzondering kan Fleequid, wegens aangetoonde operationele behoeften of op een door Fleequid aanvaard verzoek van de Koper, toestemming verlenen voor de vervroegde afhaling van het Voertuig vóór de voltooiing van voornoemde formaliteiten. In dat geval: (i) vrijwaart de Koper Fleequid, alsmede de eventuele personen op wier naam het Voertuig formeel nog is gesteld, en stelt hij hen schadeloos voor alle administratieve, fiscale, vermogensrechtelijke, sanctierechtelijke of andere gevolgen die voortvloeien uit het houden of het gebruik van het Voertuig of de deelname ervan aan het verkeer vóór de voltooiing van de formaliteiten, onverminderd hetgeen dwingendrechtelijk is toe te rekenen aan degene die zich op de vrijwaring beroept; (ii) verbindt de Koper zich ertoe alle handelingen te verrichten en alle medewerking te verlenen die noodzakelijk zijn opdat de formaliteiten van definitieve registratie, tenaamstelling of overdracht binnen 5 (vijf) dagen na de vervroegde afhaling zijn voltooid, behoudens een andere door Fleequid uitdrukkelijk schriftelijk meegedeelde termijn; (iii) verbindt de Koper zich ertoe aan Fleequid passend documentair bewijs van de verrichting of de indiening van de formaliteiten te bezorgen binnen 1 (één) dag nadat het desbetreffende document of de desbetreffende reactie van de bevoegde autoriteit beschikbaar is. In geval van een aan de Koper toe te rekenen vertraging na het verstrijken van de termijn als bedoeld in letter b) is deze aan Fleequid een boete verschuldigd van 150,00 € (honderdvijftig/00 euro) voor elke dag vertraging en voor elk betrokken Voertuig, tot aan de voltooiing van de handelingen, onverminderd het recht op vergoeding van de verdere schade. Indien de vertraging meer dan 30 (dertig) dagen bedraagt, kan Fleequid gebruikmaken van de verdere rechtsmiddelen waarin deze Algemene Voorwaarden en de wet voorzien, met inbegrip van, voor zover juridisch en feitelijk mogelijk, de bevoegdheid om bij de bevoegde autoriteiten de stappen te ondernemen die noodzakelijk zijn om de tenaamstelling van het Voertuig op naam van de daartoe gehouden persoon te verkrijgen, waarbij de desbetreffende uitgaven, lasten en kosten aan laatstgenoemde in rekening worden gebracht, onverminderd de reeds verbeurde boetes. Bij transacties waarbij gebruik wordt gemaakt van een Financieringsoplossing kan de volgorde van de handelingen van tenaamstelling, facturering, betaling, eigendomsoverdracht en levering afwijken van de gewone volgorde, overeenkomstig het bepaalde in art. 22 en in de toepasselijke Specifieke Voorwaarden, onverminderd het in dit lid vastgelegde criterium voor de eigendomsoverdracht en het bepaalde in art. 22.6; de vervroegde verrichting van documentaire handelingen of van handelingen van tenaamstelling ten gunste van de Financier leidt op zichzelf niet tot de eigendomsoverdracht en, bij Veilingen, evenmin tot de Definitieve Toewijzing.</w:t>
+        <w:t>De eigendom van het Voertuig gaat uitsluitend op de Koper over na de volledige nakoming van de betalingsverplichting overeenkomstig art. 12.2; bij Veilingen valt dit tijdstip samen met de Definitieve Toewijzing. De Partijen komen uitdrukkelijk overeen dat de eigendomsovergang op de Koper tot dat tijdstip is uitgesteld, ongeacht het toepasselijke Verkoopmodel en de gekozen wijze van uitvoering, met inbegrip van de gevallen waarin Fleequid de eigendom van het Voertuig overeenkomstig art. 18 op een eerder tijdstip heeft verkregen en de gevallen waarin de verkoop rechtstreeks tussen de Verkoper en de Koper plaatsvindt wanneer Fleequid optreedt als louter Tussenpersoon. De formaliteiten van registratie, overschrijving, inschrijving of tenaamstelling en de andere handelingen die krachtens de toepasselijke wetgeving eventueel noodzakelijk zijn, blijven onverlet. Na ontvangst van alle documenten, informatie en medewerking van de Verkoper die overeenkomstig art. 16.3 noodzakelijk zijn, draagt degene die volgens het toepasselijke Verkoopmodel en de gekozen wijze van uitvoering tot de desbetreffende handeling gehouden is, binnen de daaropvolgende 10 (tien) dagen zorg voor de vervulling van de formaliteiten die noodzakelijk zijn voor de registratie, overschrijving, inschrijving of tenaamstelling van de overdracht van het Voertuig op naam van de Koper, tenzij de toepasselijke wetgeving, de aard van de transactie of de Specifieke Voorwaarden een andere volgorde of termijn vereisen; wanneer Fleequid optreedt als louter Tussenpersoon geldt deze termijn voor de Verkoper, behoudens de andere termijn waarin de Bijzondere Verkoopvoorwaarden eventueel voorzien gelet op de transactie, het land, de documentatie of de aard van het Voertuig. Wanneer Fleequid optreedt als louter Tussenpersoon, verlopen de handelingen van de Verkoper derhalve in twee opeenvolgende fasen: a) binnen de in art. 16.3 bepaalde termijn van 5 (vijf) dagen verstrekt de Verkoper de documenten, de verklaringen, de volmachten en de medewerking die noodzakelijk zijn voor de aanvang van de formaliteiten, waarbij in geval van vertraging de in datzelfde art. 16.3 bepaalde boete van toepassing is; b) binnen de daaropvolgende 10 (tien) dagen, te rekenen vanaf het tijdstip waarop aan de voorwaarden daarvoor is voldaan, voltooit de Verkoper de overdrachtsformaliteiten; in geval van een aan de Verkoper toe te rekenen vertraging na het verstrijken van die termijn is dezelfde boete van 150,00 € (honderdvijftig/00 euro) voor elke dag vertraging en voor elk betrokken Voertuig van toepassing, overeenkomstig de in art. 16.3 bepaalde afstemming met de artt. 8.11 en 16.9. De boete met betrekking tot de tweede fase wordt niet verbeurd over de dagen waarover reeds de boete met betrekking tot de eerste fase is verbeurd. De Koper neemt er kennis van dat de overdracht van het Voertuig en de deelname ervan aan het verkeer de voltooiing kunnen vereisen van formaliteiten van registratie, overschrijving, inschrijving of soortgelijke handelingen waarin de toepasselijke wetgeving van het betrokken land voorziet, en dat het Voertuig in de regel pas kan worden afgehaald na de voltooiing van de noodzakelijke formaliteiten. Bij wijze van uitzondering kan Fleequid, wegens aangetoonde operationele behoeften of op een door Fleequid aanvaard verzoek van de Koper, toestemming verlenen voor de vervroegde afhaling van het Voertuig vóór de voltooiing van voornoemde formaliteiten. In dat geval: (i) vrijwaart de Koper Fleequid, alsmede de eventuele personen op wier naam het Voertuig formeel nog is gesteld, en stelt hij hen schadeloos voor alle administratieve, fiscale, vermogensrechtelijke, sanctierechtelijke of andere gevolgen die voortvloeien uit het houden of het gebruik van het Voertuig of de deelname ervan aan het verkeer vóór de voltooiing van de formaliteiten, onverminderd hetgeen dwingendrechtelijk is toe te rekenen aan degene die zich op de vrijwaring beroept; (ii) verbindt de Koper zich ertoe alle handelingen te verrichten en alle medewerking te verlenen die noodzakelijk zijn opdat de formaliteiten van definitieve registratie, tenaamstelling of overdracht binnen 5 (vijf) dagen na de vervroegde afhaling zijn voltooid, behoudens een andere door Fleequid uitdrukkelijk schriftelijk meegedeelde termijn; (iii) verbindt de Koper zich ertoe aan Fleequid passend documentair bewijs van de verrichting of de indiening van de formaliteiten te bezorgen binnen 1 (één) dag nadat het desbetreffende document of de desbetreffende reactie van de bevoegde autoriteit beschikbaar is. In geval van een aan de Koper toe te rekenen vertraging na het verstrijken van de termijn als bedoeld in punt (ii) is deze aan Fleequid een boete verschuldigd van 150,00 € (honderdvijftig/00 euro) voor elke dag vertraging en voor elk betrokken Voertuig, tot aan de voltooiing van de handelingen, onverminderd het recht op vergoeding van de verdere schade. Indien de vertraging meer dan 30 (dertig) dagen bedraagt, kan Fleequid gebruikmaken van de verdere rechtsmiddelen waarin deze Algemene Voorwaarden en de wet voorzien, met inbegrip van, voor zover juridisch en feitelijk mogelijk, de bevoegdheid om bij de bevoegde autoriteiten de stappen te ondernemen die noodzakelijk zijn om de tenaamstelling van het Voertuig op naam van de daartoe gehouden persoon te verkrijgen, waarbij de desbetreffende uitgaven, lasten en kosten aan laatstgenoemde in rekening worden gebracht, onverminderd de reeds verbeurde boetes. Bij transacties waarbij gebruik wordt gemaakt van een Financieringsoplossing kan de volgorde van de handelingen van tenaamstelling, facturering, betaling, eigendomsoverdracht en levering afwijken van de gewone volgorde, overeenkomstig het bepaalde in art. 22 en in de toepasselijke Specifieke Voorwaarden, onverminderd het in dit lid vastgelegde criterium voor de eigendomsoverdracht en het bepaalde in art. 22.6; de vervroegde verrichting van documentaire handelingen of van handelingen van tenaamstelling ten gunste van de Financier leidt op zichzelf niet tot de eigendomsoverdracht en, bij Veilingen, evenmin tot de Definitieve Toewijzing.</w:t>
       </w:r>
     </w:p>
     <w:p>
@@ -10470,7 +10470,7 @@
           <w:sz w:val="20"/>
           <w:szCs w:val="20"/>
         </w:rPr>
-        <w:t>De bepalingen van dit artikel zijn van toepassing op transacties die zijn gestructureerd volgens het Verkoopmodel Commissieverkoop. In het kader van dit Model voert Fleequid de transactie uit door middel van Wederverkoop overeenkomstig art. 2.5 dan wel kan zij besluiten op te treden als louter Tussenpersoon overeenkomstig art. 2.6, waarbij het Voertuig rechtstreeks door de Verkoper aan de Koper wordt overgedragen. De mogelijkheid dat de transactie op de ene of de andere wijze wordt uitgevoerd, wordt vóór het uitbrengen van het Bod kenbaar gemaakt en aanvaard overeenkomstig art. 3.2, letter a). Fleequid kan de desbetreffende keuze ook na de totstandkoming van de Bindende Overeenstemming maken, doch in elk geval niet later dan bij de terbeschikkingstelling van de Proforma, die de gekozen wijze van uitvoering vastlegt overeenkomstig art. 11.4; de Proforma vormt geen contractuele bron van de keuze, maar documenteert de uitoefening van een bevoegdheid die vooraf kenbaar is gemaakt en is aanvaard. De keuze tussen Wederverkoop en het optreden als louter Tussenpersoon wijzigt het Verkoopmodel niet, doet de door de Verkoper en de Koper aan Fleequid verleende opdracht niet vervallen en laat het recht van Fleequid op de door beiden verschuldigde Commissies onverlet. De kwalificatie van Fleequid als commissionair die in eigen naam handelt in de zin van art. 1731 van het Italiaans Burgerlijk Wetboek geldt uitsluitend bij de Wederverkoop overeenkomstig art. 2.5; wanneer Fleequid optreedt als louter Tussenpersoon, wordt de koopovereenkomst rechtstreeks tussen de Verkoper en de Koper gesloten overeenkomstig de artt. 2.6 en 17.10. Behoudens uitdrukkelijke verwijzing of hetgeen verenigbaar is met de aard van de specifieke bepaling, zijn de voorschriften van dit artikel niet van toepassing op Dealer Sales, dat is geregeld in art. 18. Indien de Verkoper vóór de terbeschikkingstelling van de Proforma een van de in de letters c), d), e) en f) van de artt. 17.8 en 17.14 bedoelde schendingen begaat waarvoor, voor hetzelfde concrete feit en ter bescherming van hetzelfde belang, geen specifieke boete uit hoofde van deze Algemene Voorwaarden geldt, is de Verkoper gehouden aan Fleequid, met betrekking tot de in art. 8.8 bedoelde rechtsverhouding inzake vermarkting en de aan Fleequid verleende opdracht en ongeacht de naderhand gekozen wijze van uitvoering, de residuele boete van 30% te betalen, vastgesteld volgens de in art. 17.8 bepaalde rangorde van grondslagen, onverminderd de vergoeding van de verdere schade; vanaf de terbeschikkingstelling van de Proforma is, naargelang de gekozen wijze van uitvoering, art. 17.8 dan wel art. 17.14 van toepassing.</w:t>
+        <w:t>De bepalingen van dit artikel zijn van toepassing op transacties die zijn gestructureerd volgens het Verkoopmodel Commissieverkoop. In het kader van dit Model voert Fleequid de transactie uit door middel van Wederverkoop overeenkomstig art. 2.5 dan wel kan zij besluiten op te treden als louter Tussenpersoon overeenkomstig art. 2.6, waarbij het Voertuig rechtstreeks door de Verkoper aan de Koper wordt overgedragen. De mogelijkheid dat de transactie op de ene of de andere wijze wordt uitgevoerd, wordt vóór het uitbrengen van het Bod kenbaar gemaakt overeenkomstig art. 3.2, letter a), en wordt aanvaard door de instemming met deze AV. Fleequid kan de desbetreffende keuze ook na de totstandkoming van de Bindende Overeenstemming maken, doch in elk geval niet later dan bij de terbeschikkingstelling van de Proforma, die de gekozen wijze van uitvoering vastlegt overeenkomstig art. 11.4; de Proforma vormt geen contractuele bron van de keuze, maar documenteert de uitoefening van een bevoegdheid die vooraf kenbaar is gemaakt en is aanvaard. De keuze tussen Wederverkoop en het optreden als louter Tussenpersoon wijzigt het Verkoopmodel niet, doet de door de Verkoper en de Koper aan Fleequid verleende opdracht niet vervallen en laat het recht van Fleequid op de door beiden verschuldigde Commissies onverlet. De kwalificatie van Fleequid als commissionair die in eigen naam handelt in de zin van art. 1731 van het Italiaans Burgerlijk Wetboek geldt uitsluitend bij de Wederverkoop overeenkomstig art. 2.5; wanneer Fleequid optreedt als louter Tussenpersoon, wordt de koopovereenkomst rechtstreeks tussen de Verkoper en de Koper gesloten overeenkomstig de artt. 2.6 en 17.10. Behoudens uitdrukkelijke verwijzing of hetgeen verenigbaar is met de aard van de specifieke bepaling, zijn de voorschriften van dit artikel niet van toepassing op Dealer Sales, dat is geregeld in art. 18. Indien de Verkoper vóór de terbeschikkingstelling van de Proforma een van de in de letters c), d), e) en f) van de artt. 17.8 en 17.14 bedoelde schendingen begaat waarvoor, voor hetzelfde concrete feit en ter bescherming van hetzelfde belang, geen specifieke boete uit hoofde van deze Algemene Voorwaarden geldt, is de Verkoper gehouden aan Fleequid, met betrekking tot de in art. 8.8 bedoelde rechtsverhouding inzake vermarkting en de aan Fleequid verleende opdracht en ongeacht de naderhand gekozen wijze van uitvoering, de residuele boete van 30% te betalen, vastgesteld volgens de in art. 17.8 bepaalde rangorde van grondslagen, onverminderd de vergoeding van de verdere schade; vanaf de terbeschikkingstelling van de Proforma is, naargelang de gekozen wijze van uitvoering, art. 17.8 dan wel art. 17.14 van toepassing.</w:t>
       </w:r>
       <w:bookmarkEnd w:id="137"/>
     </w:p>
@@ -10592,32 +10592,32 @@
           <w:sz w:val="20"/>
           <w:szCs w:val="20"/>
         </w:rPr>
-        <w:t>De prijs van het Voertuig die Fleequid bij de Wederverkoop aan de Verkoper verschuldigd is (de “Netto-aankoopprijs”) komt overeen met de Verkoopprijs voor de Koper na aftrek van de Commissies ten laste van de Verkoper, de Tarieven en elk ander bedrag dat de Verkoper op grond van deze Algemene Voorwaarden aan Fleequid verschuldigd is. De Verkoper machtigt Fleequid uitdrukkelijk om de voornoemde bedragen te verrekenen met en in mindering te brengen op de hem toekomende bedragen. De Netto-aankoopprijs wordt uitsluitend opeisbaar nadat Fleequid het Totaal Verschuldigd Bedrag volledig van de Koper heeft ontvangen overeenkomstig art. 12.2; tot dat moment kan de Verkoper geen enkele opeisbare vordering jegens Fleequid doen gelden en evenmin jegens haar betalingsvorderingen instellen, aanmaningen versturen of executiemaatregelen treffen. Het verzoek tot uitreiking van de factuur en de eventuele vervroegde uitreiking daarvan zijn van administratieve aard en maken de tegenprestatie niet opeisbaar vóór het aangegeven moment, noch vormen zij een bevestiging van de vervulling van de voorwaarden die gelden voor de aankoop van het Voertuig door Fleequid. Het bereiken van de Reserveprijs verzekert, aangezien deze wordt vastgesteld op basis van de door de Verkoper bepaalde PMIV, de Verkoper van een netto-opbrengst die ten minste gelijk is aan de PMIV, behoudens andersluidende uitdrukkelijke aanvaarding van lagere biedingen overeenkomstig art. 10.3. Indien de verkoop wordt geannuleerd of het voorwerp ervan wordt verminderd overeenkomstig art. 14, wordt de aan de Verkoper verschuldigde Netto-aankoopprijs opnieuw vastgesteld volgens de in art. 14.5 bepaalde maatstaven. De uitdrukkelijke afwijking waarin art. 22.9 voorziet voor transacties waarbij gebruik wordt gemaakt van een Financieringsoplossing, blijft onverlet. De bepalingen van dit lid zijn niet van toepassing wanneer Fleequid optreedt als louter Tussenpersoon.</w:t>
-      </w:r>
-    </w:p>
-    <w:p>
-      <w:pPr>
-        <w:pStyle w:val="Paragrafoelenco"/>
-        <w:numPr>
-          <w:ilvl w:val="1"/>
-          <w:numId w:val="1"/>
-        </w:numPr>
-        <w:spacing w:line="360" w:lineRule="auto"/>
-        <w:ind w:left="0" w:firstLine="0"/>
-        <w:jc w:val="both"/>
-        <w:rPr>
-          <w:rFonts w:ascii="Verdana" w:hAnsi="Verdana"/>
-          <w:sz w:val="20"/>
-          <w:szCs w:val="20"/>
-        </w:rPr>
-      </w:pPr>
-      <w:r>
-        <w:rPr>
-          <w:rFonts w:ascii="Verdana" w:hAnsi="Verdana"/>
-          <w:sz w:val="20"/>
-          <w:szCs w:val="20"/>
-        </w:rPr>
-        <w:t>Wanneer Fleequid overgaat tot Wederverkoop, is de Verkoper gehouden om op verzoek van Fleequid binnen 5 (vijf) dagen na het verzoek de factuur voor de verkoop van het Voertuig aan Fleequid uit te reiken, in euro en in overeenstemming met de door Fleequid meegedeelde bedragen, gegevens en aanwijzingen. De factuur vermeldt de Verkoopprijs voor de Koper alsmede de aan Fleequid verschuldigde Commissies, Tarieven en eventuele kostenvergoedingen, vermeerderd met de btw indien deze wettelijk verschuldigd is; na verrekening van hetgeen overeenkomstig art. 17.4 verschuldigd is, voldoet Fleequid de factuur aan de Verkoper zodra de Netto-aankoopprijs overeenkomstig hetzelfde art. 17.4 opeisbaar is geworden. Bij aan de Verkoper toe te rekenen vertraging in de uitreiking of de toezending van de factuur na het verstrijken van voornoemde termijn is de Verkoper gehouden aan Fleequid een boete te betalen van 150,00 € (honderdvijftig/00 euro) voor elke dag vertraging en voor elk betrokken Voertuig, tot aan de nakoming, welke boete Fleequid mag verrekenen met het factuurbedrag, onverminderd de vergoeding van de verdere schade. Indien als gevolg van niet-betaling door de Koper, de Annulering van de verkoop, de vermindering van het voorwerp ervan, de correctie van de transactie of een andere in deze Algemene Voorwaarden bepaalde oorzaak de uitreiking van een creditnota, van een storno- of correctiedocument dan wel de heruitreiking van de factuur noodzakelijk wordt, ook als gevolg van een nieuwe verkoop van het Voertuig aan een andere Bieder voor een ander bedrag, is de Verkoper gehouden daarvoor zorg te dragen binnen 5 (vijf) dagen na het verzoek van Fleequid; bij aan de Verkoper toe te rekenen vertraging is dezelfde dagboete van toepassing, die Fleequid mag verrekenen met of in mindering mag brengen op latere aan de Verkoper toekomende bedragen. De bepalingen van de artt. 15 en 16.2 inzake de restituties, de fiscale documentatie en de overige handelingen die noodzakelijk zijn voor de uitvoering of het herstel van de transactie blijven onverminderd van toepassing.</w:t>
+        <w:t>De prijs van het Voertuig die Fleequid bij de Wederverkoop aan de Verkoper verschuldigd is (de “Netto-aankoopprijs”) komt overeen met de Verkoopprijs voor de Koper na aftrek van de Commissies ten laste van de Verkoper, de Tarieven en elk ander bedrag dat de Verkoper op grond van deze Algemene Voorwaarden aan Fleequid verschuldigd is. De Verkoper machtigt Fleequid uitdrukkelijk om de voornoemde bedragen te verrekenen met en in mindering te brengen op de hem toekomende bedragen. De Netto-aankoopprijs wordt uitsluitend opeisbaar nadat Fleequid het Totaal Verschuldigd Bedrag volledig van de Koper heeft ontvangen overeenkomstig art. 12.2; tot dat moment kan de Verkoper geen enkele opeisbare vordering jegens Fleequid doen gelden en evenmin jegens haar betalingsvorderingen instellen, aanmaningen versturen of executiemaatregelen treffen. Het verzoek tot uitreiking van de factuur en de eventuele vervroegde uitreiking daarvan zijn van administratieve aard en maken de tegenprestatie niet opeisbaar vóór het aangegeven moment, noch vormen zij een bevestiging van de vervulling van de voorwaarden die gelden voor de aankoop van het Voertuig door Fleequid. Het bereiken van de Reserveprijs verzekert, aangezien deze wordt vastgesteld op basis van de door de Verkoper bepaalde PMIV, de Verkoper van een netto-opbrengst die ten minste gelijk is aan de PMIV, behoudens andersluidende uitdrukkelijke aanvaarding van lagere Biedingen overeenkomstig art. 10.3. Indien de verkoop wordt geannuleerd of het voorwerp ervan wordt verminderd overeenkomstig art. 14, wordt de aan de Verkoper verschuldigde Netto-aankoopprijs opnieuw vastgesteld volgens de in art. 14.5 bepaalde maatstaven. De uitdrukkelijke afwijking waarin art. 22.9 voorziet voor transacties waarbij gebruik wordt gemaakt van een Financieringsoplossing, blijft onverlet. De bepalingen van dit lid zijn niet van toepassing wanneer Fleequid optreedt als louter Tussenpersoon.</w:t>
+      </w:r>
+    </w:p>
+    <w:p>
+      <w:pPr>
+        <w:pStyle w:val="Paragrafoelenco"/>
+        <w:numPr>
+          <w:ilvl w:val="1"/>
+          <w:numId w:val="1"/>
+        </w:numPr>
+        <w:spacing w:line="360" w:lineRule="auto"/>
+        <w:ind w:left="0" w:firstLine="0"/>
+        <w:jc w:val="both"/>
+        <w:rPr>
+          <w:rFonts w:ascii="Verdana" w:hAnsi="Verdana"/>
+          <w:sz w:val="20"/>
+          <w:szCs w:val="20"/>
+        </w:rPr>
+      </w:pPr>
+      <w:r>
+        <w:rPr>
+          <w:rFonts w:ascii="Verdana" w:hAnsi="Verdana"/>
+          <w:sz w:val="20"/>
+          <w:szCs w:val="20"/>
+        </w:rPr>
+        <w:t>Wanneer Fleequid overgaat tot Wederverkoop, is de Verkoper gehouden om op verzoek van Fleequid binnen 5 (vijf) dagen na het verzoek de factuur voor de verkoop van het Voertuig aan Fleequid uit te reiken, in euro en in overeenstemming met de door Fleequid meegedeelde bedragen, gegevens en aanwijzingen. De factuur vermeldt de Verkoopprijs voor de Koper alsmede de aan Fleequid verschuldigde Commissies, Tarieven en eventuele kostenvergoedingen, vermeerderd met de btw indien deze wettelijk verschuldigd is; na verrekening van hetgeen overeenkomstig art. 17.4 verschuldigd is, voldoet Fleequid de factuur aan de Verkoper zodra de Netto-aankoopprijs overeenkomstig hetzelfde art. 17.4 opeisbaar is geworden. Bij vertraging in de uitreiking of de toezending van de factuur na het verstrijken van voornoemde termijn is de Verkoper gehouden aan Fleequid een boete te betalen van 150,00 € (honderdvijftig/00 euro) voor elke dag vertraging en voor elk betrokken Voertuig, tot aan de nakoming, welke boete Fleequid mag verrekenen met het factuurbedrag, onverminderd de vergoeding van de verdere schade. Indien als gevolg van niet-betaling door de Koper, de Annulering van de verkoop, de vermindering van het voorwerp ervan, de correctie van de transactie of een andere in deze Algemene Voorwaarden bepaalde oorzaak de uitreiking van een creditnota, van een storno- of correctiedocument dan wel de heruitreiking van de factuur noodzakelijk wordt, ook als gevolg van een nieuwe verkoop van het Voertuig aan een andere Bieder voor een ander bedrag, is de Verkoper gehouden daarvoor zorg te dragen binnen 5 (vijf) dagen na het verzoek van Fleequid; bij aan de Verkoper toe te rekenen vertraging is dezelfde dagboete van toepassing, die Fleequid mag verrekenen met of in mindering mag brengen op latere aan de Verkoper toekomende bedragen. De bepalingen van de artt. 15 en 16.2 inzake de restituties, de fiscale documentatie en de overige handelingen die noodzakelijk zijn voor de uitvoering of het herstel van de transactie blijven onverminderd van toepassing.</w:t>
       </w:r>
     </w:p>
     <w:p>
@@ -10692,7 +10692,7 @@
           <w:sz w:val="20"/>
           <w:szCs w:val="20"/>
         </w:rPr>
-        <w:t>Fleequid heeft het recht om de contractuele rechtsverhouding inzake de aankoop van het Voertuig van de Verkoper overeenkomstig art. 1456 van het Italiaans Burgerlijk Wetboek geheel of gedeeltelijk te ontbinden door middel van een schriftelijke mededeling waarin zij verklaart zich op dit uitdrukkelijk ontbindingsbeding te willen beroepen, en om over te gaan tot Annulering van de verkoop overeenkomstig art. 14, indien de Verkoper: a) op het Voertuig andere Bezwaringen dan de opgegeven Bezwaringen heeft gevestigd of de vestiging daarvan heeft toegestaan, dan wel niet binnen de in art. 8.3 bepaalde termijnen voor de opheffing ervan heeft gezorgd; b) niet in staat is de vrije overdracht van het Voertuig te waarborgen omdat de hem toekomende netto-opbrengst ontoereikend blijkt om de schuldeisers die recht hebben op de vrijgave van het goed te voldoen en de overige in verband met de transactie verschuldigde bedragen te betalen, dan wel omdat de begunstigden van de Bezwaringen de vrijgave of de vrije verkoop weigeren; c) bij de registratie, bij het Verkoopvoorstel of nadien valse, onjuiste, frauduleuze, verouderde of onvolledige informatie of documenten heeft verstrekt die van belang zijn voor de specifieke transactie; d) de in deze Algemene Voorwaarden bepaalde verplichtingen schendt inzake eigendom, beschikbaarheid, bewaring en instandhouding van het Voertuig, waarheidsgetrouwheid van de informatie, documentatie, exclusiviteit, eigendomsoverdracht, levering, milieuwetgeving of rechten van derden; e) dwingende rechtsregels of bestuursrechtelijke voorschriften die van toepassing zijn op de vermarkting, de overdracht of het beheer van het Voertuig, dan wel rechten van derden schendt op zodanige wijze dat de voortzetting van de transactie wordt geschaad of riskant wordt; f) weigert of nalaat de eigendom van het Voertuig over te dragen dan wel de handelingen en formaliteiten te verrichten of de medewerking te verlenen die noodzakelijk zijn voor de registratie of de tenaamstelling van het Voertuig op naam van Fleequid, of tekortschiet in de nakoming van de verplichting het Voertuig ter beschikking te stellen of te leveren overeenkomstig het bepaalde in deze Algemene Voorwaarden. Voorts blijft de bevoegdheid van Fleequid onverlet om de transactie of de vermarkting van het Voertuig op te schorten en de redelijkerwijs noodzakelijke maatregelen te treffen wanneer dit aangewezen is om fraude te voorkomen, de veiligheid van de Marketplace, van Fleequid, van de Koper of van derden te beschermen, risicosituaties te onderzoeken, verificaties uit te voeren of de naleving van de toepasselijke regelgeving, met inbegrip van de milieuwetgeving, te verzekeren; het treffen van dergelijke maatregelen heeft het karakter van een voorzorgsmaatregel en brengt op zichzelf niet de uitoefening van het uitdrukkelijk ontbindingsbeding mee, noch de toepassing van de in dit lid bepaalde boete, die de vaststelling veronderstellen van een aan de Verkoper toe te rekenen schending van de overeenkomst of van de regelgeving. In geval van ontbinding of Annulering op een van de in dit lid bepaalde gronden blijven verschuldigd de Commissies ten laste van de Verkoper die eventueel reeds overeenkomstig art. 12.4 verschuldigd zijn geworden, de Tarieven, de kosten en uitgaven die Fleequid in verband met de transactie heeft gemaakt en de overige bedragen die uit anderen hoofde verschuldigd zijn geworden. In de gevallen bedoeld in de letters c), d), e) en f) is de Verkoper, tenzij voor hetzelfde concrete feit, ter bescherming van hetzelfde belang, reeds een specifieke boete uit hoofde van deze Algemene Voorwaarden geldt, met inbegrip van, bij wijze van voorbeeld, de boetes bedoeld in de artt. 8.9, 8.11, 8.12 en 16.9, bovendien gehouden aan Fleequid bij wijze van boete een bedrag te betalen gelijk aan 30% van de Reserveprijs die is vastgesteld ter gelegenheid van de eerste Veiling met betrekking tot het Voertuig, waarbij eventuele latere verlagingen van de Reserveprijs buiten beschouwing blijven, dan wel, indien voor het Voertuig geen Veiling met Reserveprijs heeft plaatsgevonden maar voor de specifieke transactie een Reserveprijs is bepaald, aan 30% van die Reserveprijs, dan wel, indien voor de specifieke transactie geen Reserveprijs is bepaald, aan 30% van de Verkoopprijs voor de Koper, dan wel, indien ook de Verkoopprijs voor de Koper ontbreekt, aan 30% van de PMIV met betrekking tot de specifieke transactie, behoudens het bepaalde in art. 18.5 voor Dealer Sales, onverminderd de vergoeding van de verdere schade. In de gevallen waarin op grond van de vorige volzin en van art. 15.8 een specifieke boete van toepassing is in plaats van de in dit lid bepaalde boete, blijven de bevoegdheid tot ontbinding overeenkomstig art. 1456 van het Italiaans Burgerlijk Wetboek en de overige in dit lid bepaalde gevolgen, met uitzondering van de boete, onverminderd van toepassing; de gevolgen die zijn bepaald voor onderscheiden feiten of schendingen kunnen daarentegen worden gecumuleerd, overeenkomstig het bepaalde in art. 15.8. Met betrekking tot het weigeren of nalaten de eigendom van het Voertuig over te dragen als bedoeld in letter f), is de in dit lid bepaalde boete voor hetzelfde feit evenmin van toepassing voordat is voldaan aan de in art. 8.11 bepaalde voorwaarden voor de weigering; zodra aan die voorwaarden is voldaan, is de specifieke boete van art. 8.11 van toepassing, waarbij de bevoegdheid tot ontbinding overeenkomstig art. 1456 van het Italiaans Burgerlijk Wetboek en de overige in dit lid bepaalde gevolgen, met uitzondering van de boete, onverminderd van toepassing blijven.</w:t>
+        <w:t>Fleequid heeft het recht om de contractuele rechtsverhouding inzake de aankoop van het Voertuig van de Verkoper overeenkomstig art. 1456 van het Italiaans Burgerlijk Wetboek geheel of gedeeltelijk te ontbinden door middel van een schriftelijke mededeling waarin zij verklaart zich op dit uitdrukkelijk ontbindingsbeding te willen beroepen, en om over te gaan tot Annulering van de verkoop overeenkomstig art. 14, indien de Verkoper: a) op het Voertuig andere Bezwaringen dan de opgegeven Bezwaringen heeft gevestigd of de vestiging daarvan heeft toegestaan, dan wel niet binnen de in art. 8.3 bepaalde termijnen voor de opheffing ervan heeft gezorgd; b) niet in staat is de vrije overdracht van het Voertuig te waarborgen omdat de hem toekomende netto-opbrengst ontoereikend blijkt om de schuldeisers die recht hebben op de vrijgave van het goed te voldoen en de overige in verband met de transactie verschuldigde bedragen te betalen, dan wel omdat de begunstigden van de Bezwaringen de vrijgave of de vrije verkoop weigeren; c) bij de registratie, bij het Verkoopvoorstel of nadien valse, onjuiste, frauduleuze, verouderde of onvolledige informatie of documenten heeft verstrekt die van belang zijn voor de specifieke transactie; d) de in deze Algemene Voorwaarden bepaalde verplichtingen schendt inzake eigendom, beschikbaarheid, bewaring en instandhouding van het Voertuig, waarheidsgetrouwheid van de informatie, documentatie, exclusiviteit, eigendomsoverdracht, levering, milieuwetgeving of rechten van derden; e) dwingende rechtsregels of bestuursrechtelijke voorschriften die van toepassing zijn op de vermarkting, de overdracht of het beheer van het Voertuig, dan wel rechten van derden schendt op zodanige wijze dat de voortzetting van de transactie wordt geschaad of riskant wordt; f) weigert of nalaat de eigendom van het Voertuig over te dragen dan wel de handelingen en formaliteiten te verrichten of de medewerking te verlenen die noodzakelijk zijn voor de registratie of de tenaamstelling van het Voertuig op naam van Fleequid, of tekortschiet in de nakoming van de verplichting het Voertuig ter beschikking te stellen of te leveren overeenkomstig het bepaalde in deze Algemene Voorwaarden. Voorts blijft de bevoegdheid van Fleequid onverlet om de transactie of de vermarkting van het Voertuig op te schorten en de redelijkerwijs noodzakelijke maatregelen te treffen wanneer dit aangewezen is om fraude te voorkomen, de veiligheid van de Marketplace, van Fleequid, van de Koper of van derden te beschermen, risicosituaties te onderzoeken, verificaties uit te voeren of de naleving van de toepasselijke regelgeving, met inbegrip van de milieuwetgeving, te verzekeren; het treffen van dergelijke maatregelen heeft het karakter van een voorzorgsmaatregel en brengt op zichzelf niet de uitoefening van het uitdrukkelijk ontbindingsbeding mee, noch de toepassing van de in dit lid bepaalde boete, die de vaststelling veronderstellen van een aan de Verkoper toe te rekenen schending van de overeenkomst of van de regelgeving. In geval van ontbinding of Annulering op een van de in dit lid bepaalde gronden blijven verschuldigd de Commissies ten laste van de Verkoper die eventueel reeds overeenkomstig art. 12.4 verschuldigd zijn geworden, de Tarieven, de kosten en uitgaven die Fleequid in verband met de transactie heeft gemaakt en de overige bedragen die uit anderen hoofde verschuldigd zijn geworden. In de gevallen bedoeld in de letters c), d), e) en f) is de Verkoper, tenzij voor hetzelfde concrete feit, ter bescherming van hetzelfde belang, reeds een specifieke boete uit hoofde van deze Algemene Voorwaarden geldt, met inbegrip van, bij wijze van voorbeeld, de boetes bedoeld in de artt. 8.9, 8.11, 8.12 en 16.9, bovendien gehouden aan Fleequid bij wijze van boete een bedrag te betalen gelijk aan 30% van de Reserveprijs die is vastgesteld ter gelegenheid van de eerste Veiling met betrekking tot het Voertuig, waarbij eventuele latere verlagingen van de Reserveprijs buiten beschouwing blijven, dan wel, indien voor het Voertuig geen Veiling met Reserveprijs heeft plaatsgevonden maar voor de specifieke transactie een Reserveprijs is bepaald, aan 30% van die Reserveprijs, dan wel, indien voor de specifieke transactie geen Reserveprijs is bepaald, aan 30% van de Verkoopprijs voor de Koper, dan wel, indien ook de Verkoopprijs voor de Koper ontbreekt, aan 30% van de PMIV met betrekking tot de specifieke transactie, behoudens het bepaalde in art. 18.5 voor Dealer Sales, onverminderd de vergoeding van de verdere schade. In de gevallen waarin op grond van de vorige volzin en van art. 15.8 een specifieke boete van toepassing is in plaats van de in dit lid bepaalde boete, blijven de bevoegdheid tot ontbinding overeenkomstig art. 1456 van het Italiaans Burgerlijk Wetboek en de overige in dit lid bepaalde gevolgen, met uitzondering van de boete, onverminderd van toepassing; de gevolgen die zijn bepaald voor onderscheiden feiten of schendingen kunnen daarentegen worden gecumuleerd, overeenkomstig het bepaalde in art. 15.8. Met betrekking tot het weigeren of nalaten de eigendom van het Voertuig over te dragen als bedoeld in letter f), is de in dit lid bepaalde boete voor hetzelfde feit evenmin van toepassing voordat is voldaan aan de in art. 8.11 bepaalde voorwaarden voor de weigering; zodra aan die voorwaarden is voldaan, is de specifieke boete van art. 8.11, letter a), van toepassing, waarbij de bevoegdheid tot ontbinding overeenkomstig art. 1456 van het Italiaans Burgerlijk Wetboek en de overige in dit lid bepaalde gevolgen, met uitzondering van de boete, onverminderd van toepassing blijven.</w:t>
       </w:r>
     </w:p>
     <w:p>
@@ -11047,7 +11047,7 @@
           <w:sz w:val="20"/>
           <w:szCs w:val="20"/>
         </w:rPr>
-        <w:t>Bij Dealer Sales is de Verkoper gehouden om op verzoek van Fleequid binnen 5 (vijf) dagen na het verzoek de factuur voor de verkoop van het Voertuig aan Fleequid uit te reiken, overeenkomstig de door Fleequid meegedeelde gegevens en aanwijzingen. De factuur wordt uitgereikt met betrekking tot de overeenkomstig art. 18.3 overeengekomen Aankoopprijs, vermeerderd met de btw indien van toepassing en met de eventuele overige bedragen die uitsluitend op de desbetreffende rechtsverhouding van koop en verkoop betrekking hebben. Bij aan de Verkoper toe te rekenen vertraging in de uitreiking of de toezending van de factuur is de Verkoper gehouden aan Fleequid een boete te betalen van 150,00 € (honderdvijftig/00 euro) voor elke dag vertraging en voor elk betrokken Voertuig, tot aan de nakoming, onverminderd de vergoeding van de verdere schade. Indien de uitreiking van een creditnota, van een storno- of correctiedocument dan wel de heruitreiking van de factuur noodzakelijk wordt, is de Verkoper gehouden daarvoor zorg te dragen binnen 5 (vijf) dagen na het verzoek van Fleequid, waarbij in geval van vertraging dezelfde boete van toepassing is. De facturering door Fleequid aan de Koper, die is geregeld in art. 16.2, blijft afzonderlijk en zelfstandig.</w:t>
+        <w:t>Bij Dealer Sales is de Verkoper gehouden om op verzoek van Fleequid binnen 5 (vijf) dagen na het verzoek de factuur voor de verkoop van het Voertuig aan Fleequid uit te reiken, overeenkomstig de door Fleequid meegedeelde gegevens en aanwijzingen. De factuur wordt uitgereikt met betrekking tot de overeenkomstig art. 18.3 overeengekomen Aankoopprijs, vermeerderd met de btw indien van toepassing en met de eventuele overige bedragen die uitsluitend op de desbetreffende rechtsverhouding van koop en verkoop betrekking hebben. Bij vertraging in de uitreiking of de toezending van de factuur is de Verkoper gehouden aan Fleequid een boete te betalen van 150,00 € (honderdvijftig/00 euro) voor elke dag vertraging en voor elk betrokken Voertuig, tot aan de nakoming, onverminderd de vergoeding van de verdere schade. Indien de uitreiking van een creditnota, van een storno- of correctiedocument dan wel de heruitreiking van de factuur noodzakelijk wordt, is de Verkoper gehouden daarvoor zorg te dragen binnen 5 (vijf) dagen na het verzoek van Fleequid, waarbij in geval van vertraging dezelfde boete van toepassing is. De facturering door Fleequid aan de Koper, die is geregeld in art. 16.2, blijft afzonderlijk en zelfstandig.</w:t>
       </w:r>
     </w:p>
     <w:p>
@@ -11075,7 +11075,7 @@
           <w:sz w:val="20"/>
           <w:szCs w:val="20"/>
         </w:rPr>
-        <w:t>In de rechtsverhouding inzake aankoop tussen de Verkoper en Fleequid blijven de verklaringen, de garanties en de verplichtingen tot vrijwaring, vergoeding en regres die deze Algemene Voorwaarden aan de Verkoper opleggen, met inbegrip van die bepaald in de artt. 8.3, 8.12, 8.13 en 19.6, integraal van toepassing, evenals de regeling van de melding en de desbetreffende termijnen van art. 17.7 en het uitdrukkelijk ontbindingsbeding en de economische gevolgen van art. 17.8, die van toepassing zijn op de door Fleequid bij Dealer Sales gesloten aankoopovereenkomst; voor de bepaling van de in art. 17.8 bepaalde boete wordt, indien voor het Voertuig noch een Reserveprijs noch een Verkoopprijs voor de Koper bestaat, zoals zich in het bijzonder bij de aankoop op voorraad kan voordoen, de laatste subsidiaire grondslag, in plaats van door de PMIV, gevormd door de Aankoopprijs die Fleequid aan de Verkoper verschuldigd is. De aankoop van het Voertuig door Fleequid doet deze bescherming niet tenietgaan en beperkt haar niet. De vrijwaring van art. 8.13 geldt uitdrukkelijk ook voor de aanspraken die de Koper jegens Fleequid als daadwerkelijke verkoper geldend maakt, alsmede voor de bedragen, kosten, reparaties, uitgaven, lasten en schade die Fleequid in die hoedanigheid draagt wegens aan de Verkoper toe te rekenen feiten, gebreken, defecten, omissies of tekortkomingen, met recht van regres en van volledige vergoeding jegens de Verkoper. Indien een aan de Verkoper toe te rekenen afwijking, gebrek, schade of andere omstandigheid na de doorverkoop van het Voertuig aan het licht komt of door de Koper wordt gemeld, behoudt Fleequid het recht zich daarop jegens de Verkoper te beroepen binnen de in art. 17.7 bepaalde termijnen, die, indien het feit niet reeds eerder aan Fleequid bekend was, ingaan op het moment van de ontdekking ervan of van de ontvangst van de klacht van de Koper. De betaling van de Aankoopprijs, de inontvangstneming van het Voertuig door Fleequid of door haar ingeschakelde personen en de daaropvolgende doorverkoop aan de Koper houden geen afstand in van de rechten op vrijwaring, regres en vergoeding of van de overige rechtsmiddelen die Fleequid jegens de Verkoper toekomen.</w:t>
+        <w:t>In de rechtsverhouding inzake aankoop tussen de Verkoper en Fleequid blijven de verklaringen, de garanties en de verplichtingen tot vrijwaring, vergoeding en regres die deze Algemene Voorwaarden aan de Verkoper opleggen, met inbegrip van die bepaald in de artt. 8.3, 8.12, 8.13 en 19.6, integraal van toepassing, evenals de regeling van de melding en de desbetreffende termijnen van art. 17.7 en het uitdrukkelijk ontbindingsbeding en de economische gevolgen van art. 17.8, die van toepassing zijn op de door Fleequid bij Dealer Sales gesloten aankoopovereenkomst; voor de bepaling van de in art. 17.8 bepaalde boete wordt, indien voor het Voertuig noch een Reserveprijs noch een Verkoopprijs voor de Koper bestaat, zoals zich in het bijzonder bij de aankoop op voorraad kan voordoen, de laatste subsidiaire grondslag, in plaats van door de PMIV, gevormd door de Aankoopprijs die Fleequid aan de Verkoper verschuldigd is. De aankoop van het Voertuig door Fleequid doet deze bescherming niet tenietgaan en beperkt haar niet. De vrijwaring van art. 8.13 geldt uitdrukkelijk ook voor de aanspraken die de Koper jegens Fleequid als daadwerkelijke verkoper geldend maakt, alsmede voor de bedragen, kosten, reparaties, uitgaven, lasten en schade die Fleequid in die hoedanigheid draagt wegens aan de Verkoper toe te rekenen feiten, gebreken, defecten, omissies of tekortkomingen, met recht van regres en van volledige vergoeding jegens de Verkoper. Indien een aan de Verkoper toe te rekenen afwijking, gebrek, beschadiging van het Voertuig of andere omstandigheid na de doorverkoop van het Voertuig aan het licht komt of door de Koper wordt gemeld, behoudt Fleequid het recht zich daarop jegens de Verkoper te beroepen binnen de in art. 17.7 bepaalde termijnen, die, indien het feit niet reeds eerder aan Fleequid bekend was, ingaan op het moment van de ontdekking ervan of van de ontvangst van de klacht van de Koper. De betaling van de Aankoopprijs, de inontvangstneming van het Voertuig door Fleequid of door haar ingeschakelde personen en de daaropvolgende doorverkoop aan de Koper houden geen afstand in van de rechten op vrijwaring, regres en vergoeding of van de overige rechtsmiddelen die Fleequid jegens de Verkoper toekomen.</w:t>
       </w:r>
     </w:p>
     <w:p>
@@ -11479,7 +11479,7 @@
           <w:sz w:val="20"/>
           <w:szCs w:val="20"/>
         </w:rPr>
-        <w:t>Vóór het uitbrengen van het Bod is de Koper gehouden, met de zorgvuldigheid die zijn professionele hoedanigheid vereist, de Advertentie, de Technische Specificaties, het TrustReport indien beschikbaar, de foto's, de documentatie en alle andere informatie die met betrekking tot het Voertuig ter beschikking is gesteld te onderzoeken, alsmede gebruik te maken van de mogelijkheid om het Voertuig te bezichtigen, te inspecteren en te testen, indien deze door Fleequid of door de Verkoper wordt geboden. De gebreken, de defecten, de afwijkingen, de gebruiksstaat, de slijtage, de non-conformiteiten of de ontbrekende elementen — ook indien zij betrekking hebben op niet onmiddellijk zichtbare of niet gemakkelijk bereikbare delen — die blijken uit de ter beschikking gestelde informatie of documentatie dan wel die de Koper had kunnen vaststellen door deze te onderzoeken of door gebruik te maken van de eventuele mogelijkheid tot inspectie en test van het Voertuig, kunnen niet als verborgen gebreken worden aangemerkt en kunnen geen grond vormen voor aanspraken uit hoofde van garantie, prijsvermindering, schadeloosstelling of schadevergoeding. Het niet uitvoeren van de inspectie of de test, die door Fleequid steeds worden aangeboden, blijft voor risico van de Koper en kan niet leiden tot een verruiming van de toepasselijke garantieregeling. De in dit lid bedoelde onderzoeks- en inspectielast bestaat bij alle Verkoopmodellen en bij alle wijzen van uitvoering.</w:t>
+        <w:t>Vóór het uitbrengen van het Bod is de Koper gehouden, met de zorgvuldigheid die zijn professionele hoedanigheid vereist, de Advertentie, de Technische Specificaties, het TrustReport indien beschikbaar, de foto's, de documentatie en alle andere informatie die met betrekking tot het Voertuig ter beschikking is gesteld te onderzoeken, alsmede gebruik te maken van de mogelijkheid om het Voertuig te bezichtigen, te inspecteren en te testen. De gebreken, de defecten, de afwijkingen, de gebruiksstaat, de slijtage, de non-conformiteiten of de ontbrekende elementen — ook indien zij betrekking hebben op niet onmiddellijk zichtbare of niet gemakkelijk bereikbare delen — die blijken uit de ter beschikking gestelde informatie of documentatie dan wel die de Koper had kunnen vaststellen door deze te onderzoeken of door gebruik te maken van de mogelijkheid tot inspectie en test van het Voertuig, kunnen niet als verborgen gebreken worden aangemerkt en kunnen geen grond vormen voor aanspraken uit hoofde van garantie, prijsvermindering, schadeloosstelling of schadevergoeding. Het niet uitvoeren van de inspectie of de test, die door Fleequid steeds worden aangeboden, blijft voor risico van de Koper en kan niet leiden tot een verruiming van de toepasselijke garantieregeling. De in dit lid bedoelde onderzoeks- en inspectielast bestaat bij alle Verkoopmodellen en bij alle wijzen van uitvoering.</w:t>
       </w:r>
     </w:p>
     <w:p>
@@ -11892,10 +11892,19 @@
       <w:r>
         <w:rPr>
           <w:rFonts w:ascii="Verdana" w:hAnsi="Verdana"/>
-          <w:sz w:val="20"/>
-          <w:szCs w:val="20"/>
-        </w:rPr>
-        <w:t>Commissieverkoop waarbij Fleequid optreedt als louter Tussenpersoon. Wanneer Fleequid overeenkomstig art. 2.6 optreedt, bestaan de koopovereenkomst en de daarmee verband houdende garantieverhouding rechtstreeks en uitsluitend tussen de Verkoper en de Koper, binnen de grenzen, met de uitsluitingen en volgens de contractuele termijnen waarin dit artikel voorziet, die de Verkoper en de Koper uitdrukkelijk overeenkomen ook op hun rechtstreekse verhouding toe te passen. Fleequid koopt het Voertuig niet, verkrijgt niet de hoedanigheid van verkoper en staat niet in voor de conformiteit, de eigenschappen, de gebreken of de defecten daarvan, noch voor de nakoming van de garantieverplichtingen van de Verkoper. De Verkoper en de Koper verbinden zich ertoe, ieder voor zover het hem aangaat, Fleequid te vrijwaren en schadeloos te stellen voor elke vordering, elke rechtsvordering, elk verweer en elke aanspraak uit hoofde van garantie, teruggave, prijsvermindering, schadeloosstelling of schadevergoeding, alsmede voor de daarmee verband houdende kosten en uitgaven, die betrekking heeft op het Voertuig of op de desbetreffende koopovereenkomst. De verbindingsclausule van art. 21 is niet van toepassing, aangezien Fleequid geen partij is bij de koopovereenkomst.</w:t>
+          <w:b/>
+          <w:sz w:val="20"/>
+          <w:szCs w:val="20"/>
+        </w:rPr>
+        <w:t>Commissieverkoop waarbij Fleequid optreedt als louter Tussenpersoon</w:t>
+      </w:r>
+      <w:r>
+        <w:rPr>
+          <w:rFonts w:ascii="Verdana" w:hAnsi="Verdana"/>
+          <w:sz w:val="20"/>
+          <w:szCs w:val="20"/>
+        </w:rPr>
+        <w:t>. Wanneer Fleequid overeenkomstig art. 2.6 optreedt, bestaan de koopovereenkomst en de daarmee verband houdende garantieverhouding rechtstreeks en uitsluitend tussen de Verkoper en de Koper, binnen de grenzen, met de uitsluitingen en volgens de contractuele termijnen waarin dit artikel voorziet, die de Verkoper en de Koper uitdrukkelijk overeenkomen ook op hun rechtstreekse verhouding toe te passen. Fleequid koopt het Voertuig niet, verkrijgt niet de hoedanigheid van verkoper en staat niet in voor de conformiteit, de eigenschappen, de gebreken of de defecten daarvan, noch voor de nakoming van de garantieverplichtingen van de Verkoper. De Verkoper en de Koper verbinden zich ertoe, ieder voor zover het hem aangaat, Fleequid te vrijwaren en schadeloos te stellen voor elke vordering, elke rechtsvordering, elk verweer en elke aanspraak uit hoofde van garantie, teruggave, prijsvermindering, schadeloosstelling of schadevergoeding, alsmede voor de daarmee verband houdende kosten en uitgaven, die betrekking heeft op het Voertuig of op de desbetreffende koopovereenkomst. De verbindingsclausule van art. 21 is niet van toepassing, aangezien Fleequid geen partij is bij de koopovereenkomst.</w:t>
       </w:r>
     </w:p>
     <w:p>
@@ -11929,7 +11938,7 @@
           <w:sz w:val="20"/>
           <w:szCs w:val="20"/>
         </w:rPr>
-        <w:t>. Bij verkopen die volgens Dealer Sales worden gesloten, heeft Fleequid ten aanzien van de Koper de hoedanigheid van daadwerkelijke verkoper, maar is de garantie uitsluitend die welke voortvloeit uit het in dit artikel opgenomen beding tussen Professionals, met alle daarin bepaalde uitsluitingen, beperkingen, voorwaarden en vervalgronden. Geen enkele verdere, uitdrukkelijke of stilzwijgende, garantie kan worden geacht door Fleequid te zijn verleend, tenzij deze bij de afzonderlijke transactie specifiek schriftelijk op zich is genomen. De melding van gebreken, defecten of afwijkingen dient, op straffe van verval, te geschieden binnen de termijnen en op de wijze bepaald in art. 20.2 en in elk geval binnen 30 (dertig) dagen na de levering en op voorwaarde dat het Voertuig nadien niet meer dan 1.000 (duizend) km heeft afgelegd; de Partijen komen uitdrukkelijk overeen dat deze termijnen gelden als contractuele vervaltermijnen in de zin van art. 1495 van het Italiaans Burgerlijk Wetboek. Voorts blijft het bepaalde in art. 16.12 van toepassing op de zichtbare gebreken, schade en afwijkingen die op het moment van de levering kunnen worden vastgesteld. De eventuele aansprakelijkheid van Fleequid kan zich in geen geval verder uitstrekken dan de uitdrukkelijk overeengekomen garantieregeling, onverminderd de garanties, de vrijwaringen, de verplichtingen tot vergoeding en de regresrechten die Fleequid jegens de oorspronkelijke Verkoper toekomen krachtens de artt. 8.13, 18.5 en 19.6. Op Dealer Sales is de verbindingsclausule van art. 21 niet van toepassing en de desbetreffende regeling is niet vatbaar voor analoge toepassing.</w:t>
+        <w:t>. Bij verkopen die volgens Dealer Sales worden gesloten, heeft Fleequid ten aanzien van de Koper de hoedanigheid van daadwerkelijke verkoper, maar is de garantie uitsluitend die welke voortvloeit uit het in dit artikel opgenomen beding tussen Professionals, met alle daarin bepaalde uitsluitingen, beperkingen, voorwaarden en vervalgronden. Geen enkele verdere, uitdrukkelijke of stilzwijgende, garantie kan worden geacht door Fleequid te zijn verleend, tenzij deze bij de afzonderlijke transactie specifiek schriftelijk op zich is genomen. De melding van gebreken, defecten of afwijkingen dient, op straffe van verval, te geschieden binnen de termijnen en op de wijze bepaald in art. 20.2 en in elk geval binnen 30 (dertig) kalenderdagen na de levering en op voorwaarde dat het Voertuig nadien niet meer dan 1.000 (duizend) km heeft afgelegd; de Partijen komen uitdrukkelijk overeen dat deze termijnen gelden als contractuele vervaltermijnen in de zin van art. 1495 van het Italiaans Burgerlijk Wetboek. Voorts blijft het bepaalde in art. 16.12 van toepassing op de zichtbare gebreken, schade en afwijkingen die op het moment van de levering kunnen worden vastgesteld. De eventuele aansprakelijkheid van Fleequid kan zich in geen geval verder uitstrekken dan de uitdrukkelijk overeengekomen garantieregeling, onverminderd de garanties, de vrijwaringen, de verplichtingen tot vergoeding en de regresrechten die Fleequid jegens de oorspronkelijke Verkoper toekomen krachtens de artt. 8.13, 18.5 en 19.6. Op Dealer Sales is de verbindingsclausule van art. 21 niet van toepassing en de desbetreffende regeling is niet vatbaar voor analoge toepassing.</w:t>
       </w:r>
     </w:p>
     <w:p>
@@ -12101,7 +12110,7 @@
           <w:sz w:val="20"/>
           <w:szCs w:val="20"/>
         </w:rPr>
-        <w:t xml:space="preserve"> of via enig ander middel dat het bewijs van ontvangst door Fleequid oplevert. De afwijkingen, gebreken en defecten die op het moment van de levering kunnen worden vastgesteld, dienen vooraf te worden gemeld overeenkomstig het bepaalde in art. 16.12. Op straffe van verval dient de klacht Fleequid uiterlijk binnen 30 (dertig) dagen na de datum van levering te bereiken en voordat het Voertuig nog eens 1.000 (duizend) km heeft afgelegd. De klacht dient de informatie en de documentatie, waaronder foto's, te bevatten die nodig zijn voor de beoordeling van de betwisting; Fleequid kan nadere documenten of toelichtingen opvragen, die de Koper binnen 5 (vijf) dagen na het verzoek dient te verstrekken. Bij niet-naleving van de voornoemde termijnen of van de vereiste wijze van indiening kan Fleequid de klacht niet in behandeling nemen en deze afsluiten, en is zij niet gehouden klachten in aanmerking te nemen die zijn ingediend met inachtneming van andere termijnen, een andere wijze van indiening of andere informatie dan voorgeschreven. De in dit lid bepaalde termijnen gelden als contractuele vervaltermijnen bij alle Verkoopmodellen, onder het voorbehoud van art. 19.8 en onverminderd, in de verhouding tussen Fleequid en de Verkoper, de afwijkende meldingstermijnen waarin de artt. 17.7 en 18.5 voorzien.</w:t>
+        <w:t xml:space="preserve"> of via enig ander middel dat het bewijs van ontvangst door Fleequid oplevert. De afwijkingen, gebreken en defecten die op het moment van de levering kunnen worden vastgesteld, dienen vooraf te worden gemeld overeenkomstig het bepaalde in art. 16.12. Op straffe van verval dient de klacht Fleequid uiterlijk binnen 30 (dertig) kalenderdagen na de datum van levering te bereiken en voordat het Voertuig nog eens 1.000 (duizend) km heeft afgelegd. De klacht dient de informatie en de documentatie, waaronder foto's, te bevatten die nodig zijn voor de beoordeling van de betwisting; Fleequid kan nadere documenten of toelichtingen opvragen, die de Koper binnen 5 (vijf) dagen na het verzoek dient te verstrekken. Bij niet-naleving van de voornoemde termijnen of van de vereiste wijze van indiening kan Fleequid de klacht niet in behandeling nemen en deze afsluiten, en is zij niet gehouden klachten in aanmerking te nemen die zijn ingediend met inachtneming van andere termijnen, een andere wijze van indiening of andere informatie dan voorgeschreven. De in dit lid bepaalde termijnen gelden als contractuele vervaltermijnen bij alle Verkoopmodellen, onder het voorbehoud van art. 19.8 en onverminderd, in de verhouding tussen Fleequid en de Verkoper, de afwijkende meldingstermijnen waarin de artt. 17.7 en 18.5 voorzien.</w:t>
       </w:r>
     </w:p>
     <w:p>
@@ -12595,7 +12604,7 @@
           <w:sz w:val="20"/>
           <w:szCs w:val="20"/>
         </w:rPr>
-        <w:t>Voor de toepassing van art. 12.2 kunnen de Specifieke Voorwaarden aan een onherroepelijke toezegging van de Financier die aan de daarin bepaalde vereisten voldoet, een werking toekennen die gelijkstaat aan de volledige nakoming van de betalingsverplichting, onder vaststelling van het moment vanaf hetwelk die werking intreedt. Bij gebreke van een dergelijke uitdrukkelijke bepaling zijn uitsluitend de door de respectieve ontvangers daadwerkelijk ontvangen betalingen van belang.</w:t>
+        <w:t>Voor de toepassing van art. 12.2 kunnen de Specifieke Voorwaarden aan een onherroepelijke toezegging van de Financier die aan de in diezelfde Specifieke Voorwaarden bepaalde vereisten voldoet, een werking toekennen die gelijkstaat aan de volledige nakoming van de betalingsverplichting, onder vaststelling van het moment vanaf hetwelk die werking intreedt. Bij gebreke van een dergelijke uitdrukkelijke bepaling zijn uitsluitend de door de respectieve ontvangers daadwerkelijk ontvangen betalingen van belang.</w:t>
       </w:r>
     </w:p>
     <w:p>
@@ -13016,7 +13025,7 @@
           <w:sz w:val="20"/>
           <w:szCs w:val="20"/>
         </w:rPr>
-        <w:t>22077 Olgiate Comasco (CO),</w:t>
+        <w:t>22077 Olgiate Comasco (CO)</w:t>
       </w:r>
     </w:p>
     <w:p>
@@ -13559,7 +13568,7 @@
           <w:sz w:val="20"/>
           <w:szCs w:val="20"/>
         </w:rPr>
-        <w:t>Art. 13 (Uitgestelde verkoop: aanbetaling en tijdelijk bij de Verkoper in gebruik blijvend Voertuig)</w:t>
+        <w:t>Art. 13 (Uitgestelde verkoop: Aanbetaling en tijdelijk bij de Verkoper in gebruik blijvend Voertuig)</w:t>
       </w:r>
       <w:r>
         <w:rPr>

</xml_diff>